<commit_message>
UPDATE: Added feature where prints text file to command line as well
</commit_message>
<xml_diff>
--- a/logbook.docx
+++ b/logbook.docx
@@ -168,13 +168,8 @@
         </w:rPr>
       </w:pPr>
       <w:r>
-        <w:rPr>
-          <w:noProof/>
-        </w:rPr>
-      </w:r>
-      <w:r>
-        <w:pict w14:anchorId="6BC323D3">
-          <v:rect id="Horizontal Line 1" o:spid="_x0000_s1026" style="width:451.3pt;height:1.1pt;visibility:visible;mso-wrap-style:square;mso-left-percent:-10001;mso-top-percent:-10001;mso-position-horizontal:absolute;mso-position-horizontal-relative:char;mso-position-vertical:absolute;mso-position-vertical-relative:line;mso-left-percent:-10001;mso-top-percent:-10001;v-text-anchor:top" o:gfxdata="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" filled="f">
+        <w:pict w14:anchorId="1D97DB5A">
+          <v:rect id="Horizontal Line 1" o:spid="_x0000_s1026" alt="" style="width:451.3pt;height:1.1pt;visibility:visible;mso-wrap-style:square;mso-width-percent:0;mso-height-percent:0;mso-left-percent:-10001;mso-top-percent:-10001;mso-position-horizontal:absolute;mso-position-horizontal-relative:char;mso-position-vertical:absolute;mso-position-vertical-relative:line;mso-width-percent:0;mso-height-percent:0;mso-left-percent:-10001;mso-top-percent:-10001;v-text-anchor:top" filled="f">
             <o:lock v:ext="edit" rotation="t" aspectratio="t" verticies="t" text="t" shapetype="t"/>
             <w10:anchorlock/>
           </v:rect>
@@ -199,231 +194,82 @@
         <w:rPr>
           <w:rFonts w:ascii="Calibri" w:hAnsi="Calibri" w:cs="Calibri"/>
         </w:rPr>
-        <w:t>A structure chart is created to visually represent the different modules in the system. Below is a simple structure chart of the system.</w:t>
-      </w:r>
-    </w:p>
-    <w:p>
-      <w:pPr>
-        <w:rPr>
-          <w:rFonts w:ascii="Calibri" w:hAnsi="Calibri" w:cs="Calibri"/>
-        </w:rPr>
-      </w:pPr>
-      <w:r>
-        <w:rPr>
-          <w:rFonts w:ascii="Calibri" w:hAnsi="Calibri" w:cs="Calibri"/>
-        </w:rPr>
-        <w:t>Insert Structure Chart Here</w:t>
-      </w:r>
-    </w:p>
-    <w:p>
-      <w:pPr>
-        <w:rPr>
-          <w:rFonts w:ascii="Calibri" w:hAnsi="Calibri" w:cs="Calibri"/>
-        </w:rPr>
-      </w:pPr>
-    </w:p>
-    <w:p>
-      <w:pPr>
-        <w:rPr>
-          <w:rFonts w:ascii="Calibri" w:hAnsi="Calibri" w:cs="Calibri"/>
-        </w:rPr>
-      </w:pPr>
-    </w:p>
-    <w:p>
-      <w:pPr>
-        <w:rPr>
-          <w:rFonts w:ascii="Calibri" w:hAnsi="Calibri" w:cs="Calibri"/>
-        </w:rPr>
-      </w:pPr>
-    </w:p>
-    <w:p>
-      <w:pPr>
-        <w:rPr>
-          <w:rFonts w:ascii="Calibri" w:hAnsi="Calibri" w:cs="Calibri"/>
-        </w:rPr>
-      </w:pPr>
-    </w:p>
-    <w:p>
-      <w:pPr>
-        <w:rPr>
-          <w:rFonts w:ascii="Calibri" w:hAnsi="Calibri" w:cs="Calibri"/>
-        </w:rPr>
-      </w:pPr>
-    </w:p>
-    <w:p>
-      <w:pPr>
-        <w:rPr>
-          <w:rFonts w:ascii="Calibri" w:hAnsi="Calibri" w:cs="Calibri"/>
-        </w:rPr>
-      </w:pPr>
-    </w:p>
-    <w:p>
-      <w:pPr>
-        <w:rPr>
-          <w:rFonts w:ascii="Calibri" w:hAnsi="Calibri" w:cs="Calibri"/>
-        </w:rPr>
-      </w:pPr>
-    </w:p>
-    <w:p>
-      <w:pPr>
-        <w:rPr>
-          <w:rFonts w:ascii="Calibri" w:hAnsi="Calibri" w:cs="Calibri"/>
-        </w:rPr>
-      </w:pPr>
-    </w:p>
-    <w:p>
-      <w:pPr>
-        <w:rPr>
-          <w:rFonts w:ascii="Calibri" w:hAnsi="Calibri" w:cs="Calibri"/>
-        </w:rPr>
-      </w:pPr>
-    </w:p>
-    <w:p>
-      <w:pPr>
-        <w:rPr>
-          <w:rFonts w:ascii="Calibri" w:hAnsi="Calibri" w:cs="Calibri"/>
-        </w:rPr>
-      </w:pPr>
-    </w:p>
-    <w:p>
-      <w:pPr>
-        <w:rPr>
-          <w:rFonts w:ascii="Calibri" w:hAnsi="Calibri" w:cs="Calibri"/>
-        </w:rPr>
-      </w:pPr>
-    </w:p>
-    <w:p>
-      <w:pPr>
-        <w:rPr>
-          <w:rFonts w:ascii="Calibri" w:hAnsi="Calibri" w:cs="Calibri"/>
-        </w:rPr>
-      </w:pPr>
-    </w:p>
-    <w:p>
-      <w:pPr>
-        <w:rPr>
-          <w:rFonts w:ascii="Calibri" w:hAnsi="Calibri" w:cs="Calibri"/>
-        </w:rPr>
-      </w:pPr>
-    </w:p>
-    <w:p>
-      <w:pPr>
-        <w:rPr>
-          <w:rFonts w:ascii="Calibri" w:hAnsi="Calibri" w:cs="Calibri"/>
-        </w:rPr>
-      </w:pPr>
-    </w:p>
-    <w:p>
-      <w:pPr>
-        <w:rPr>
-          <w:rFonts w:ascii="Calibri" w:hAnsi="Calibri" w:cs="Calibri"/>
-        </w:rPr>
-      </w:pPr>
-    </w:p>
-    <w:p>
-      <w:pPr>
-        <w:rPr>
-          <w:rFonts w:ascii="Calibri" w:hAnsi="Calibri" w:cs="Calibri"/>
-        </w:rPr>
-      </w:pPr>
-    </w:p>
-    <w:p>
-      <w:pPr>
-        <w:rPr>
-          <w:rFonts w:ascii="Calibri" w:hAnsi="Calibri" w:cs="Calibri"/>
-        </w:rPr>
-      </w:pPr>
-    </w:p>
-    <w:p>
-      <w:pPr>
-        <w:rPr>
-          <w:rFonts w:ascii="Calibri" w:hAnsi="Calibri" w:cs="Calibri"/>
-        </w:rPr>
-      </w:pPr>
-    </w:p>
-    <w:p>
-      <w:pPr>
-        <w:rPr>
-          <w:rFonts w:ascii="Calibri" w:hAnsi="Calibri" w:cs="Calibri"/>
-        </w:rPr>
-      </w:pPr>
-    </w:p>
-    <w:p>
-      <w:pPr>
-        <w:rPr>
-          <w:rFonts w:ascii="Calibri" w:hAnsi="Calibri" w:cs="Calibri"/>
-        </w:rPr>
-      </w:pPr>
-    </w:p>
-    <w:p>
-      <w:pPr>
-        <w:rPr>
-          <w:rFonts w:ascii="Calibri" w:hAnsi="Calibri" w:cs="Calibri"/>
-        </w:rPr>
-      </w:pPr>
-    </w:p>
-    <w:p>
-      <w:pPr>
-        <w:rPr>
-          <w:rFonts w:ascii="Calibri" w:hAnsi="Calibri" w:cs="Calibri"/>
-        </w:rPr>
-      </w:pPr>
-    </w:p>
-    <w:p>
-      <w:pPr>
-        <w:rPr>
-          <w:rFonts w:ascii="Calibri" w:hAnsi="Calibri" w:cs="Calibri"/>
-        </w:rPr>
-      </w:pPr>
-    </w:p>
-    <w:p>
-      <w:pPr>
-        <w:rPr>
-          <w:rFonts w:ascii="Calibri" w:hAnsi="Calibri" w:cs="Calibri"/>
-        </w:rPr>
-      </w:pPr>
-    </w:p>
-    <w:p>
-      <w:pPr>
-        <w:rPr>
-          <w:rFonts w:ascii="Calibri" w:hAnsi="Calibri" w:cs="Calibri"/>
-        </w:rPr>
-      </w:pPr>
-    </w:p>
-    <w:p>
-      <w:pPr>
-        <w:rPr>
-          <w:rFonts w:ascii="Calibri" w:hAnsi="Calibri" w:cs="Calibri"/>
-        </w:rPr>
-      </w:pPr>
-    </w:p>
-    <w:p>
-      <w:pPr>
-        <w:rPr>
-          <w:rFonts w:ascii="Calibri" w:hAnsi="Calibri" w:cs="Calibri"/>
-        </w:rPr>
-      </w:pPr>
-    </w:p>
-    <w:p>
-      <w:pPr>
-        <w:rPr>
-          <w:rFonts w:ascii="Calibri" w:hAnsi="Calibri" w:cs="Calibri"/>
-        </w:rPr>
-      </w:pPr>
-    </w:p>
-    <w:p>
-      <w:pPr>
-        <w:rPr>
-          <w:rFonts w:ascii="Calibri" w:hAnsi="Calibri" w:cs="Calibri"/>
-        </w:rPr>
-      </w:pPr>
-    </w:p>
-    <w:p>
-      <w:pPr>
-        <w:rPr>
-          <w:rFonts w:ascii="Calibri" w:hAnsi="Calibri" w:cs="Calibri"/>
-        </w:rPr>
-      </w:pPr>
+        <w:t xml:space="preserve">A structure chart is created to visually represent the different modules in the system. </w:t>
+      </w:r>
+    </w:p>
+    <w:p>
+      <w:pPr>
+        <w:rPr>
+          <w:rFonts w:ascii="Calibri" w:hAnsi="Calibri" w:cs="Calibri"/>
+        </w:rPr>
+      </w:pPr>
+      <w:r>
+        <w:rPr>
+          <w:rFonts w:ascii="Calibri" w:hAnsi="Calibri" w:cs="Calibri"/>
+        </w:rPr>
+        <w:t>Below is a simple structure chart of the system</w:t>
+      </w:r>
+      <w:r>
+        <w:rPr>
+          <w:rFonts w:ascii="Calibri" w:hAnsi="Calibri" w:cs="Calibri"/>
+        </w:rPr>
+        <w:t>:</w:t>
+      </w:r>
+    </w:p>
+    <w:p>
+      <w:pPr>
+        <w:rPr>
+          <w:rFonts w:ascii="Calibri" w:hAnsi="Calibri" w:cs="Calibri"/>
+        </w:rPr>
+      </w:pPr>
+      <w:r>
+        <w:rPr>
+          <w:rFonts w:ascii="Calibri" w:hAnsi="Calibri" w:cs="Calibri"/>
+          <w:noProof/>
+          <w14:ligatures w14:val="standardContextual"/>
+        </w:rPr>
+        <w:drawing>
+          <wp:inline distT="0" distB="0" distL="0" distR="0" wp14:anchorId="460766B5" wp14:editId="2F45AEE2">
+            <wp:extent cx="2923953" cy="5652976"/>
+            <wp:effectExtent l="0" t="0" r="0" b="0"/>
+            <wp:docPr id="1143619032" name="Picture 1"/>
+            <wp:cNvGraphicFramePr>
+              <a:graphicFrameLocks xmlns:a="http://schemas.openxmlformats.org/drawingml/2006/main" noChangeAspect="1"/>
+            </wp:cNvGraphicFramePr>
+            <a:graphic xmlns:a="http://schemas.openxmlformats.org/drawingml/2006/main">
+              <a:graphicData uri="http://schemas.openxmlformats.org/drawingml/2006/picture">
+                <pic:pic xmlns:pic="http://schemas.openxmlformats.org/drawingml/2006/picture">
+                  <pic:nvPicPr>
+                    <pic:cNvPr id="1143619032" name="Picture 1143619032"/>
+                    <pic:cNvPicPr/>
+                  </pic:nvPicPr>
+                  <pic:blipFill>
+                    <a:blip r:embed="rId6">
+                      <a:extLst>
+                        <a:ext uri="{28A0092B-C50C-407E-A947-70E740481C1C}">
+                          <a14:useLocalDpi xmlns:a14="http://schemas.microsoft.com/office/drawing/2010/main" val="0"/>
+                        </a:ext>
+                      </a:extLst>
+                    </a:blip>
+                    <a:stretch>
+                      <a:fillRect/>
+                    </a:stretch>
+                  </pic:blipFill>
+                  <pic:spPr>
+                    <a:xfrm>
+                      <a:off x="0" y="0"/>
+                      <a:ext cx="2957946" cy="5718695"/>
+                    </a:xfrm>
+                    <a:prstGeom prst="rect">
+                      <a:avLst/>
+                    </a:prstGeom>
+                  </pic:spPr>
+                </pic:pic>
+              </a:graphicData>
+            </a:graphic>
+          </wp:inline>
+        </w:drawing>
+      </w:r>
     </w:p>
     <w:p>
       <w:pPr>
@@ -456,15 +302,15 @@
           <w:noProof/>
         </w:rPr>
         <w:drawing>
-          <wp:anchor distT="0" distB="0" distL="114300" distR="114300" simplePos="0" relativeHeight="251660288" behindDoc="0" locked="0" layoutInCell="1" allowOverlap="1" wp14:anchorId="577774B0" wp14:editId="571E0C7A">
+          <wp:anchor distT="0" distB="0" distL="114300" distR="114300" simplePos="0" relativeHeight="251660288" behindDoc="0" locked="0" layoutInCell="1" allowOverlap="1" wp14:anchorId="577774B0" wp14:editId="62720FA3">
             <wp:simplePos x="0" y="0"/>
             <wp:positionH relativeFrom="column">
-              <wp:posOffset>-751014</wp:posOffset>
+              <wp:posOffset>-755015</wp:posOffset>
             </wp:positionH>
             <wp:positionV relativeFrom="paragraph">
-              <wp:posOffset>300355</wp:posOffset>
+              <wp:posOffset>305435</wp:posOffset>
             </wp:positionV>
-            <wp:extent cx="4156075" cy="6486525"/>
+            <wp:extent cx="4699000" cy="7334250"/>
             <wp:effectExtent l="0" t="0" r="0" b="0"/>
             <wp:wrapSquare wrapText="bothSides"/>
             <wp:docPr id="1778004380" name="Picture 1"/>
@@ -481,7 +327,7 @@
                     </pic:cNvPicPr>
                   </pic:nvPicPr>
                   <pic:blipFill>
-                    <a:blip r:embed="rId6">
+                    <a:blip r:embed="rId7">
                       <a:extLst>
                         <a:ext uri="{28A0092B-C50C-407E-A947-70E740481C1C}">
                           <a14:useLocalDpi xmlns:a14="http://schemas.microsoft.com/office/drawing/2010/main" val="0"/>
@@ -496,7 +342,7 @@
                   <pic:spPr bwMode="auto">
                     <a:xfrm>
                       <a:off x="0" y="0"/>
-                      <a:ext cx="4156075" cy="6486525"/>
+                      <a:ext cx="4699000" cy="7334250"/>
                     </a:xfrm>
                     <a:prstGeom prst="rect">
                       <a:avLst/>
@@ -549,7 +395,23 @@
           <w:b/>
           <w:bCs/>
         </w:rPr>
-        <w:t xml:space="preserve">  </w:t>
+        <w:t xml:space="preserve"> </w:t>
+      </w:r>
+      <w:r>
+        <w:rPr>
+          <w:rFonts w:ascii="Calibri" w:hAnsi="Calibri" w:cs="Calibri"/>
+          <w:b/>
+          <w:bCs/>
+        </w:rPr>
+        <w:t xml:space="preserve">          </w:t>
+      </w:r>
+      <w:r>
+        <w:rPr>
+          <w:rFonts w:ascii="Calibri" w:hAnsi="Calibri" w:cs="Calibri"/>
+          <w:b/>
+          <w:bCs/>
+        </w:rPr>
+        <w:t xml:space="preserve"> </w:t>
       </w:r>
       <w:r>
         <w:rPr>
@@ -563,22 +425,17 @@
     </w:p>
     <w:p>
       <w:r>
-        <w:t xml:space="preserve"> </w:t>
-      </w:r>
-    </w:p>
-    <w:p>
-      <w:r>
         <w:rPr>
           <w:noProof/>
         </w:rPr>
         <w:drawing>
-          <wp:anchor distT="0" distB="0" distL="114300" distR="114300" simplePos="0" relativeHeight="251659264" behindDoc="0" locked="0" layoutInCell="1" allowOverlap="1" wp14:anchorId="3F84EA97" wp14:editId="621E73ED">
+          <wp:anchor distT="0" distB="0" distL="114300" distR="114300" simplePos="0" relativeHeight="251659264" behindDoc="0" locked="0" layoutInCell="1" allowOverlap="1" wp14:anchorId="3F84EA97" wp14:editId="7D254737">
             <wp:simplePos x="0" y="0"/>
             <wp:positionH relativeFrom="column">
-              <wp:posOffset>3596640</wp:posOffset>
+              <wp:posOffset>3947160</wp:posOffset>
             </wp:positionH>
             <wp:positionV relativeFrom="paragraph">
-              <wp:posOffset>154940</wp:posOffset>
+              <wp:posOffset>117549</wp:posOffset>
             </wp:positionV>
             <wp:extent cx="1665297" cy="7362000"/>
             <wp:effectExtent l="0" t="0" r="0" b="0"/>
@@ -597,7 +454,7 @@
                     </pic:cNvPicPr>
                   </pic:nvPicPr>
                   <pic:blipFill>
-                    <a:blip r:embed="rId7">
+                    <a:blip r:embed="rId8">
                       <a:extLst>
                         <a:ext uri="{28A0092B-C50C-407E-A947-70E740481C1C}">
                           <a14:useLocalDpi xmlns:a14="http://schemas.microsoft.com/office/drawing/2010/main" val="0"/>
@@ -634,7 +491,11 @@
           </wp:anchor>
         </w:drawing>
       </w:r>
-    </w:p>
+      <w:r>
+        <w:t xml:space="preserve"> </w:t>
+      </w:r>
+    </w:p>
+    <w:p/>
     <w:p>
       <w:pPr>
         <w:rPr>
@@ -649,362 +510,6 @@
       <w:pPr>
         <w:rPr>
           <w:rFonts w:ascii="Calibri" w:hAnsi="Calibri" w:cs="Calibri"/>
-        </w:rPr>
-      </w:pPr>
-    </w:p>
-    <w:p>
-      <w:pPr>
-        <w:rPr>
-          <w:rFonts w:ascii="Calibri" w:hAnsi="Calibri" w:cs="Calibri"/>
-        </w:rPr>
-      </w:pPr>
-    </w:p>
-    <w:p>
-      <w:pPr>
-        <w:rPr>
-          <w:rFonts w:ascii="Calibri" w:hAnsi="Calibri" w:cs="Calibri"/>
-          <w:b/>
-          <w:bCs/>
-        </w:rPr>
-      </w:pPr>
-    </w:p>
-    <w:p>
-      <w:pPr>
-        <w:rPr>
-          <w:rFonts w:ascii="Calibri" w:hAnsi="Calibri" w:cs="Calibri"/>
-          <w:b/>
-          <w:bCs/>
-        </w:rPr>
-      </w:pPr>
-    </w:p>
-    <w:p>
-      <w:pPr>
-        <w:rPr>
-          <w:rFonts w:ascii="Calibri" w:hAnsi="Calibri" w:cs="Calibri"/>
-          <w:b/>
-          <w:bCs/>
-        </w:rPr>
-      </w:pPr>
-    </w:p>
-    <w:p>
-      <w:pPr>
-        <w:rPr>
-          <w:rFonts w:ascii="Calibri" w:hAnsi="Calibri" w:cs="Calibri"/>
-          <w:b/>
-          <w:bCs/>
-        </w:rPr>
-      </w:pPr>
-    </w:p>
-    <w:p>
-      <w:pPr>
-        <w:rPr>
-          <w:rFonts w:ascii="Calibri" w:hAnsi="Calibri" w:cs="Calibri"/>
-          <w:b/>
-          <w:bCs/>
-        </w:rPr>
-      </w:pPr>
-    </w:p>
-    <w:p>
-      <w:pPr>
-        <w:rPr>
-          <w:rFonts w:ascii="Calibri" w:hAnsi="Calibri" w:cs="Calibri"/>
-          <w:b/>
-          <w:bCs/>
-        </w:rPr>
-      </w:pPr>
-    </w:p>
-    <w:p>
-      <w:pPr>
-        <w:rPr>
-          <w:rFonts w:ascii="Calibri" w:hAnsi="Calibri" w:cs="Calibri"/>
-          <w:b/>
-          <w:bCs/>
-        </w:rPr>
-      </w:pPr>
-    </w:p>
-    <w:p>
-      <w:pPr>
-        <w:rPr>
-          <w:rFonts w:ascii="Calibri" w:hAnsi="Calibri" w:cs="Calibri"/>
-          <w:b/>
-          <w:bCs/>
-        </w:rPr>
-      </w:pPr>
-    </w:p>
-    <w:p>
-      <w:pPr>
-        <w:rPr>
-          <w:rFonts w:ascii="Calibri" w:hAnsi="Calibri" w:cs="Calibri"/>
-          <w:b/>
-          <w:bCs/>
-        </w:rPr>
-      </w:pPr>
-    </w:p>
-    <w:p>
-      <w:pPr>
-        <w:rPr>
-          <w:rFonts w:ascii="Calibri" w:hAnsi="Calibri" w:cs="Calibri"/>
-          <w:b/>
-          <w:bCs/>
-        </w:rPr>
-      </w:pPr>
-    </w:p>
-    <w:p>
-      <w:pPr>
-        <w:rPr>
-          <w:rFonts w:ascii="Calibri" w:hAnsi="Calibri" w:cs="Calibri"/>
-          <w:b/>
-          <w:bCs/>
-        </w:rPr>
-      </w:pPr>
-    </w:p>
-    <w:p>
-      <w:pPr>
-        <w:rPr>
-          <w:rFonts w:ascii="Calibri" w:hAnsi="Calibri" w:cs="Calibri"/>
-          <w:b/>
-          <w:bCs/>
-        </w:rPr>
-      </w:pPr>
-    </w:p>
-    <w:p>
-      <w:pPr>
-        <w:rPr>
-          <w:rFonts w:ascii="Calibri" w:hAnsi="Calibri" w:cs="Calibri"/>
-          <w:b/>
-          <w:bCs/>
-        </w:rPr>
-      </w:pPr>
-    </w:p>
-    <w:p>
-      <w:pPr>
-        <w:rPr>
-          <w:rFonts w:ascii="Calibri" w:hAnsi="Calibri" w:cs="Calibri"/>
-          <w:b/>
-          <w:bCs/>
-        </w:rPr>
-      </w:pPr>
-    </w:p>
-    <w:p>
-      <w:pPr>
-        <w:rPr>
-          <w:rFonts w:ascii="Calibri" w:hAnsi="Calibri" w:cs="Calibri"/>
-          <w:b/>
-          <w:bCs/>
-        </w:rPr>
-      </w:pPr>
-    </w:p>
-    <w:p>
-      <w:pPr>
-        <w:rPr>
-          <w:rFonts w:ascii="Calibri" w:hAnsi="Calibri" w:cs="Calibri"/>
-          <w:b/>
-          <w:bCs/>
-        </w:rPr>
-      </w:pPr>
-    </w:p>
-    <w:p>
-      <w:pPr>
-        <w:rPr>
-          <w:rFonts w:ascii="Calibri" w:hAnsi="Calibri" w:cs="Calibri"/>
-          <w:b/>
-          <w:bCs/>
-        </w:rPr>
-      </w:pPr>
-    </w:p>
-    <w:p>
-      <w:pPr>
-        <w:rPr>
-          <w:rFonts w:ascii="Calibri" w:hAnsi="Calibri" w:cs="Calibri"/>
-          <w:b/>
-          <w:bCs/>
-        </w:rPr>
-      </w:pPr>
-    </w:p>
-    <w:p>
-      <w:pPr>
-        <w:rPr>
-          <w:rFonts w:ascii="Calibri" w:hAnsi="Calibri" w:cs="Calibri"/>
-          <w:b/>
-          <w:bCs/>
-        </w:rPr>
-      </w:pPr>
-    </w:p>
-    <w:p>
-      <w:pPr>
-        <w:rPr>
-          <w:rFonts w:ascii="Calibri" w:hAnsi="Calibri" w:cs="Calibri"/>
-          <w:b/>
-          <w:bCs/>
-        </w:rPr>
-      </w:pPr>
-    </w:p>
-    <w:p>
-      <w:pPr>
-        <w:rPr>
-          <w:rFonts w:ascii="Calibri" w:hAnsi="Calibri" w:cs="Calibri"/>
-          <w:b/>
-          <w:bCs/>
-        </w:rPr>
-      </w:pPr>
-    </w:p>
-    <w:p>
-      <w:pPr>
-        <w:rPr>
-          <w:rFonts w:ascii="Calibri" w:hAnsi="Calibri" w:cs="Calibri"/>
-          <w:b/>
-          <w:bCs/>
-        </w:rPr>
-      </w:pPr>
-    </w:p>
-    <w:p>
-      <w:pPr>
-        <w:rPr>
-          <w:rFonts w:ascii="Calibri" w:hAnsi="Calibri" w:cs="Calibri"/>
-          <w:b/>
-          <w:bCs/>
-        </w:rPr>
-      </w:pPr>
-    </w:p>
-    <w:p>
-      <w:pPr>
-        <w:rPr>
-          <w:rFonts w:ascii="Calibri" w:hAnsi="Calibri" w:cs="Calibri"/>
-          <w:b/>
-          <w:bCs/>
-        </w:rPr>
-      </w:pPr>
-    </w:p>
-    <w:p>
-      <w:pPr>
-        <w:rPr>
-          <w:rFonts w:ascii="Calibri" w:hAnsi="Calibri" w:cs="Calibri"/>
-          <w:b/>
-          <w:bCs/>
-        </w:rPr>
-      </w:pPr>
-    </w:p>
-    <w:p>
-      <w:pPr>
-        <w:rPr>
-          <w:rFonts w:ascii="Calibri" w:hAnsi="Calibri" w:cs="Calibri"/>
-          <w:b/>
-          <w:bCs/>
-        </w:rPr>
-      </w:pPr>
-    </w:p>
-    <w:p>
-      <w:pPr>
-        <w:rPr>
-          <w:rFonts w:ascii="Calibri" w:hAnsi="Calibri" w:cs="Calibri"/>
-          <w:b/>
-          <w:bCs/>
-        </w:rPr>
-      </w:pPr>
-    </w:p>
-    <w:p>
-      <w:pPr>
-        <w:rPr>
-          <w:rFonts w:ascii="Calibri" w:hAnsi="Calibri" w:cs="Calibri"/>
-          <w:b/>
-          <w:bCs/>
-        </w:rPr>
-      </w:pPr>
-    </w:p>
-    <w:p>
-      <w:pPr>
-        <w:rPr>
-          <w:rFonts w:ascii="Calibri" w:hAnsi="Calibri" w:cs="Calibri"/>
-          <w:b/>
-          <w:bCs/>
-        </w:rPr>
-      </w:pPr>
-    </w:p>
-    <w:p>
-      <w:pPr>
-        <w:rPr>
-          <w:rFonts w:ascii="Calibri" w:hAnsi="Calibri" w:cs="Calibri"/>
-          <w:b/>
-          <w:bCs/>
-        </w:rPr>
-      </w:pPr>
-    </w:p>
-    <w:p>
-      <w:pPr>
-        <w:rPr>
-          <w:rFonts w:ascii="Calibri" w:hAnsi="Calibri" w:cs="Calibri"/>
-          <w:b/>
-          <w:bCs/>
-        </w:rPr>
-      </w:pPr>
-    </w:p>
-    <w:p>
-      <w:pPr>
-        <w:rPr>
-          <w:rFonts w:ascii="Calibri" w:hAnsi="Calibri" w:cs="Calibri"/>
-          <w:b/>
-          <w:bCs/>
-        </w:rPr>
-      </w:pPr>
-    </w:p>
-    <w:p>
-      <w:pPr>
-        <w:rPr>
-          <w:rFonts w:ascii="Calibri" w:hAnsi="Calibri" w:cs="Calibri"/>
-          <w:b/>
-          <w:bCs/>
-        </w:rPr>
-      </w:pPr>
-    </w:p>
-    <w:p>
-      <w:pPr>
-        <w:rPr>
-          <w:rFonts w:ascii="Calibri" w:hAnsi="Calibri" w:cs="Calibri"/>
-          <w:b/>
-          <w:bCs/>
-        </w:rPr>
-      </w:pPr>
-    </w:p>
-    <w:p>
-      <w:pPr>
-        <w:rPr>
-          <w:rFonts w:ascii="Calibri" w:hAnsi="Calibri" w:cs="Calibri"/>
-          <w:b/>
-          <w:bCs/>
-        </w:rPr>
-      </w:pPr>
-    </w:p>
-    <w:p>
-      <w:pPr>
-        <w:rPr>
-          <w:rFonts w:ascii="Calibri" w:hAnsi="Calibri" w:cs="Calibri"/>
-          <w:b/>
-          <w:bCs/>
-        </w:rPr>
-      </w:pPr>
-    </w:p>
-    <w:p>
-      <w:pPr>
-        <w:rPr>
-          <w:rFonts w:ascii="Calibri" w:hAnsi="Calibri" w:cs="Calibri"/>
-          <w:b/>
-          <w:bCs/>
-        </w:rPr>
-      </w:pPr>
-    </w:p>
-    <w:p>
-      <w:pPr>
-        <w:rPr>
-          <w:rFonts w:ascii="Calibri" w:hAnsi="Calibri" w:cs="Calibri"/>
-          <w:b/>
-          <w:bCs/>
-        </w:rPr>
-      </w:pPr>
-    </w:p>
-    <w:p>
-      <w:pPr>
-        <w:rPr>
-          <w:rFonts w:ascii="Calibri" w:hAnsi="Calibri" w:cs="Calibri"/>
           <w:b/>
           <w:bCs/>
           <w:u w:val="single"/>
@@ -1012,129 +517,19 @@
       </w:pPr>
       <w:r>
         <w:rPr>
-          <w:rFonts w:ascii="Calibri" w:hAnsi="Calibri" w:cs="Calibri"/>
-          <w:b/>
-          <w:bCs/>
+          <w:noProof/>
         </w:rPr>
         <w:lastRenderedPageBreak/>
-        <w:t xml:space="preserve">                         </w:t>
-      </w:r>
-      <w:r>
-        <w:rPr>
-          <w:rFonts w:ascii="Calibri" w:hAnsi="Calibri" w:cs="Calibri"/>
-          <w:b/>
-          <w:bCs/>
-          <w:u w:val="single"/>
-        </w:rPr>
-        <w:t>Waveform.c</w:t>
-      </w:r>
-      <w:r>
-        <w:rPr>
-          <w:rFonts w:ascii="Calibri" w:hAnsi="Calibri" w:cs="Calibri"/>
-          <w:b/>
-          <w:bCs/>
-        </w:rPr>
-        <w:t xml:space="preserve">                                                                  </w:t>
-      </w:r>
-      <w:r>
-        <w:rPr>
-          <w:rFonts w:ascii="Calibri" w:hAnsi="Calibri" w:cs="Calibri"/>
-          <w:b/>
-          <w:bCs/>
-          <w:u w:val="single"/>
-        </w:rPr>
-        <w:t>IO.c</w:t>
-      </w:r>
-    </w:p>
-    <w:p>
-      <w:pPr>
-        <w:rPr>
-          <w:rFonts w:ascii="Calibri" w:hAnsi="Calibri" w:cs="Calibri"/>
-          <w:b/>
-          <w:bCs/>
-        </w:rPr>
-      </w:pPr>
-      <w:r>
-        <w:rPr>
-          <w:noProof/>
-        </w:rPr>
         <w:drawing>
-          <wp:anchor distT="0" distB="0" distL="114300" distR="114300" simplePos="0" relativeHeight="251661312" behindDoc="0" locked="0" layoutInCell="1" allowOverlap="1" wp14:anchorId="058B7CD9" wp14:editId="4A33E67A">
+          <wp:anchor distT="0" distB="0" distL="114300" distR="114300" simplePos="0" relativeHeight="251658240" behindDoc="0" locked="0" layoutInCell="1" allowOverlap="1" wp14:anchorId="5A5776A0" wp14:editId="0BD39A71">
             <wp:simplePos x="0" y="0"/>
             <wp:positionH relativeFrom="column">
-              <wp:posOffset>3389630</wp:posOffset>
+              <wp:posOffset>-542674</wp:posOffset>
             </wp:positionH>
             <wp:positionV relativeFrom="paragraph">
-              <wp:posOffset>175260</wp:posOffset>
+              <wp:posOffset>361315</wp:posOffset>
             </wp:positionV>
-            <wp:extent cx="2354580" cy="6044565"/>
-            <wp:effectExtent l="0" t="0" r="0" b="0"/>
-            <wp:wrapSquare wrapText="bothSides"/>
-            <wp:docPr id="1756851777" name="Picture 4"/>
-            <wp:cNvGraphicFramePr>
-              <a:graphicFrameLocks xmlns:a="http://schemas.openxmlformats.org/drawingml/2006/main" noChangeAspect="1"/>
-            </wp:cNvGraphicFramePr>
-            <a:graphic xmlns:a="http://schemas.openxmlformats.org/drawingml/2006/main">
-              <a:graphicData uri="http://schemas.openxmlformats.org/drawingml/2006/picture">
-                <pic:pic xmlns:pic="http://schemas.openxmlformats.org/drawingml/2006/picture">
-                  <pic:nvPicPr>
-                    <pic:cNvPr id="0" name="Picture 7"/>
-                    <pic:cNvPicPr>
-                      <a:picLocks noChangeAspect="1" noChangeArrowheads="1"/>
-                    </pic:cNvPicPr>
-                  </pic:nvPicPr>
-                  <pic:blipFill>
-                    <a:blip r:embed="rId8">
-                      <a:extLst>
-                        <a:ext uri="{28A0092B-C50C-407E-A947-70E740481C1C}">
-                          <a14:useLocalDpi xmlns:a14="http://schemas.microsoft.com/office/drawing/2010/main" val="0"/>
-                        </a:ext>
-                      </a:extLst>
-                    </a:blip>
-                    <a:srcRect/>
-                    <a:stretch>
-                      <a:fillRect/>
-                    </a:stretch>
-                  </pic:blipFill>
-                  <pic:spPr bwMode="auto">
-                    <a:xfrm>
-                      <a:off x="0" y="0"/>
-                      <a:ext cx="2354580" cy="6044565"/>
-                    </a:xfrm>
-                    <a:prstGeom prst="rect">
-                      <a:avLst/>
-                    </a:prstGeom>
-                    <a:noFill/>
-                    <a:ln>
-                      <a:noFill/>
-                    </a:ln>
-                  </pic:spPr>
-                </pic:pic>
-              </a:graphicData>
-            </a:graphic>
-            <wp14:sizeRelH relativeFrom="page">
-              <wp14:pctWidth>0</wp14:pctWidth>
-            </wp14:sizeRelH>
-            <wp14:sizeRelV relativeFrom="page">
-              <wp14:pctHeight>0</wp14:pctHeight>
-            </wp14:sizeRelV>
-          </wp:anchor>
-        </w:drawing>
-      </w:r>
-      <w:r>
-        <w:rPr>
-          <w:noProof/>
-        </w:rPr>
-        <w:drawing>
-          <wp:anchor distT="0" distB="0" distL="114300" distR="114300" simplePos="0" relativeHeight="251658240" behindDoc="0" locked="0" layoutInCell="1" allowOverlap="1" wp14:anchorId="5A5776A0" wp14:editId="7189B4D5">
-            <wp:simplePos x="0" y="0"/>
-            <wp:positionH relativeFrom="column">
-              <wp:posOffset>-275590</wp:posOffset>
-            </wp:positionH>
-            <wp:positionV relativeFrom="paragraph">
-              <wp:posOffset>175967</wp:posOffset>
-            </wp:positionV>
-            <wp:extent cx="3096260" cy="5928360"/>
+            <wp:extent cx="3803650" cy="7282815"/>
             <wp:effectExtent l="0" t="0" r="0" b="0"/>
             <wp:wrapSquare wrapText="bothSides"/>
             <wp:docPr id="954808225" name="Picture 3"/>
@@ -1166,7 +561,7 @@
                   <pic:spPr bwMode="auto">
                     <a:xfrm>
                       <a:off x="0" y="0"/>
-                      <a:ext cx="3096260" cy="5928360"/>
+                      <a:ext cx="3803650" cy="7282815"/>
                     </a:xfrm>
                     <a:prstGeom prst="rect">
                       <a:avLst/>
@@ -1188,427 +583,160 @@
           </wp:anchor>
         </w:drawing>
       </w:r>
-    </w:p>
-    <w:p>
-      <w:pPr>
-        <w:rPr>
-          <w:rFonts w:ascii="Calibri" w:hAnsi="Calibri" w:cs="Calibri"/>
-          <w:b/>
-          <w:bCs/>
-        </w:rPr>
-      </w:pPr>
-    </w:p>
-    <w:p>
-      <w:pPr>
-        <w:rPr>
-          <w:rFonts w:ascii="Calibri" w:hAnsi="Calibri" w:cs="Calibri"/>
-          <w:b/>
-          <w:bCs/>
-        </w:rPr>
-      </w:pPr>
-    </w:p>
-    <w:p>
-      <w:pPr>
-        <w:rPr>
-          <w:rFonts w:ascii="Calibri" w:hAnsi="Calibri" w:cs="Calibri"/>
-          <w:b/>
-          <w:bCs/>
-        </w:rPr>
-      </w:pPr>
-    </w:p>
-    <w:p/>
-    <w:p>
-      <w:pPr>
-        <w:rPr>
-          <w:rFonts w:ascii="Calibri" w:hAnsi="Calibri" w:cs="Calibri"/>
-          <w:b/>
-          <w:bCs/>
-        </w:rPr>
-      </w:pPr>
-    </w:p>
-    <w:p>
-      <w:pPr>
-        <w:rPr>
-          <w:rFonts w:ascii="Calibri" w:hAnsi="Calibri" w:cs="Calibri"/>
-          <w:b/>
-          <w:bCs/>
-        </w:rPr>
-      </w:pPr>
-    </w:p>
-    <w:p>
-      <w:pPr>
-        <w:rPr>
-          <w:rFonts w:ascii="Calibri" w:hAnsi="Calibri" w:cs="Calibri"/>
-          <w:b/>
-          <w:bCs/>
-        </w:rPr>
-      </w:pPr>
-    </w:p>
-    <w:p>
-      <w:pPr>
-        <w:rPr>
-          <w:rFonts w:ascii="Calibri" w:hAnsi="Calibri" w:cs="Calibri"/>
-          <w:b/>
-          <w:bCs/>
-        </w:rPr>
-      </w:pPr>
-    </w:p>
-    <w:p>
-      <w:pPr>
-        <w:rPr>
-          <w:rFonts w:ascii="Calibri" w:hAnsi="Calibri" w:cs="Calibri"/>
-          <w:b/>
-          <w:bCs/>
-        </w:rPr>
-      </w:pPr>
-    </w:p>
-    <w:p>
-      <w:pPr>
-        <w:rPr>
-          <w:rFonts w:ascii="Calibri" w:hAnsi="Calibri" w:cs="Calibri"/>
-          <w:b/>
-          <w:bCs/>
-        </w:rPr>
-      </w:pPr>
-    </w:p>
-    <w:p>
-      <w:pPr>
-        <w:rPr>
-          <w:rFonts w:ascii="Calibri" w:hAnsi="Calibri" w:cs="Calibri"/>
-          <w:b/>
-          <w:bCs/>
-        </w:rPr>
-      </w:pPr>
-    </w:p>
-    <w:p>
-      <w:pPr>
-        <w:rPr>
-          <w:rFonts w:ascii="Calibri" w:hAnsi="Calibri" w:cs="Calibri"/>
-          <w:b/>
-          <w:bCs/>
-        </w:rPr>
-      </w:pPr>
-    </w:p>
-    <w:p>
-      <w:pPr>
-        <w:rPr>
-          <w:rFonts w:ascii="Calibri" w:hAnsi="Calibri" w:cs="Calibri"/>
-          <w:b/>
-          <w:bCs/>
-        </w:rPr>
-      </w:pPr>
-    </w:p>
-    <w:p>
-      <w:pPr>
-        <w:rPr>
-          <w:rFonts w:ascii="Calibri" w:hAnsi="Calibri" w:cs="Calibri"/>
-          <w:b/>
-          <w:bCs/>
-        </w:rPr>
-      </w:pPr>
-    </w:p>
-    <w:p>
-      <w:pPr>
-        <w:rPr>
-          <w:rFonts w:ascii="Calibri" w:hAnsi="Calibri" w:cs="Calibri"/>
-          <w:b/>
-          <w:bCs/>
-        </w:rPr>
-      </w:pPr>
-    </w:p>
-    <w:p>
-      <w:pPr>
-        <w:rPr>
-          <w:rFonts w:ascii="Calibri" w:hAnsi="Calibri" w:cs="Calibri"/>
-          <w:b/>
-          <w:bCs/>
-        </w:rPr>
-      </w:pPr>
-    </w:p>
-    <w:p>
-      <w:pPr>
-        <w:rPr>
-          <w:rFonts w:ascii="Calibri" w:hAnsi="Calibri" w:cs="Calibri"/>
-          <w:b/>
-          <w:bCs/>
-        </w:rPr>
-      </w:pPr>
-    </w:p>
-    <w:p>
-      <w:pPr>
-        <w:rPr>
-          <w:rFonts w:ascii="Calibri" w:hAnsi="Calibri" w:cs="Calibri"/>
-          <w:b/>
-          <w:bCs/>
-        </w:rPr>
-      </w:pPr>
-    </w:p>
-    <w:p>
-      <w:pPr>
-        <w:rPr>
-          <w:rFonts w:ascii="Calibri" w:hAnsi="Calibri" w:cs="Calibri"/>
-          <w:b/>
-          <w:bCs/>
-        </w:rPr>
-      </w:pPr>
-    </w:p>
-    <w:p>
-      <w:pPr>
-        <w:rPr>
-          <w:rFonts w:ascii="Calibri" w:hAnsi="Calibri" w:cs="Calibri"/>
-          <w:b/>
-          <w:bCs/>
-        </w:rPr>
-      </w:pPr>
-    </w:p>
-    <w:p>
-      <w:pPr>
-        <w:rPr>
-          <w:rFonts w:ascii="Calibri" w:hAnsi="Calibri" w:cs="Calibri"/>
-          <w:b/>
-          <w:bCs/>
-        </w:rPr>
-      </w:pPr>
-    </w:p>
-    <w:p>
-      <w:pPr>
-        <w:rPr>
-          <w:rFonts w:ascii="Calibri" w:hAnsi="Calibri" w:cs="Calibri"/>
-          <w:b/>
-          <w:bCs/>
-        </w:rPr>
-      </w:pPr>
-    </w:p>
-    <w:p>
-      <w:pPr>
-        <w:rPr>
-          <w:rFonts w:ascii="Calibri" w:hAnsi="Calibri" w:cs="Calibri"/>
-          <w:b/>
-          <w:bCs/>
-        </w:rPr>
-      </w:pPr>
-    </w:p>
-    <w:p>
-      <w:pPr>
-        <w:rPr>
-          <w:rFonts w:ascii="Calibri" w:hAnsi="Calibri" w:cs="Calibri"/>
-          <w:b/>
-          <w:bCs/>
-        </w:rPr>
-      </w:pPr>
-    </w:p>
-    <w:p>
-      <w:pPr>
-        <w:rPr>
-          <w:rFonts w:ascii="Calibri" w:hAnsi="Calibri" w:cs="Calibri"/>
-          <w:b/>
-          <w:bCs/>
-        </w:rPr>
-      </w:pPr>
-    </w:p>
-    <w:p>
-      <w:pPr>
-        <w:rPr>
-          <w:rFonts w:ascii="Calibri" w:hAnsi="Calibri" w:cs="Calibri"/>
-          <w:b/>
-          <w:bCs/>
-        </w:rPr>
-      </w:pPr>
-    </w:p>
-    <w:p>
-      <w:pPr>
-        <w:rPr>
-          <w:rFonts w:ascii="Calibri" w:hAnsi="Calibri" w:cs="Calibri"/>
-          <w:b/>
-          <w:bCs/>
-        </w:rPr>
-      </w:pPr>
-    </w:p>
-    <w:p>
-      <w:pPr>
-        <w:rPr>
-          <w:rFonts w:ascii="Calibri" w:hAnsi="Calibri" w:cs="Calibri"/>
-          <w:b/>
-          <w:bCs/>
-        </w:rPr>
-      </w:pPr>
-    </w:p>
-    <w:p>
-      <w:pPr>
-        <w:rPr>
-          <w:rFonts w:ascii="Calibri" w:hAnsi="Calibri" w:cs="Calibri"/>
-          <w:b/>
-          <w:bCs/>
-        </w:rPr>
-      </w:pPr>
-    </w:p>
-    <w:p>
-      <w:pPr>
-        <w:rPr>
-          <w:rFonts w:ascii="Calibri" w:hAnsi="Calibri" w:cs="Calibri"/>
-          <w:b/>
-          <w:bCs/>
-        </w:rPr>
-      </w:pPr>
-    </w:p>
-    <w:p>
-      <w:pPr>
-        <w:rPr>
-          <w:rFonts w:ascii="Calibri" w:hAnsi="Calibri" w:cs="Calibri"/>
-          <w:b/>
-          <w:bCs/>
-        </w:rPr>
-      </w:pPr>
-    </w:p>
-    <w:p>
-      <w:pPr>
-        <w:rPr>
-          <w:rFonts w:ascii="Calibri" w:hAnsi="Calibri" w:cs="Calibri"/>
-          <w:b/>
-          <w:bCs/>
-        </w:rPr>
-      </w:pPr>
-    </w:p>
-    <w:p>
-      <w:pPr>
-        <w:rPr>
-          <w:rFonts w:ascii="Calibri" w:hAnsi="Calibri" w:cs="Calibri"/>
-          <w:b/>
-          <w:bCs/>
-        </w:rPr>
-      </w:pPr>
-    </w:p>
-    <w:p>
-      <w:pPr>
-        <w:rPr>
-          <w:rFonts w:ascii="Calibri" w:hAnsi="Calibri" w:cs="Calibri"/>
-          <w:b/>
-          <w:bCs/>
-        </w:rPr>
-      </w:pPr>
-    </w:p>
-    <w:p>
-      <w:pPr>
-        <w:rPr>
-          <w:rFonts w:ascii="Calibri" w:hAnsi="Calibri" w:cs="Calibri"/>
-          <w:b/>
-          <w:bCs/>
-        </w:rPr>
-      </w:pPr>
-    </w:p>
-    <w:p>
-      <w:pPr>
-        <w:rPr>
-          <w:rFonts w:ascii="Calibri" w:hAnsi="Calibri" w:cs="Calibri"/>
-          <w:b/>
-          <w:bCs/>
-        </w:rPr>
-      </w:pPr>
-    </w:p>
-    <w:p>
-      <w:pPr>
-        <w:rPr>
-          <w:rFonts w:ascii="Calibri" w:hAnsi="Calibri" w:cs="Calibri"/>
-          <w:b/>
-          <w:bCs/>
-        </w:rPr>
-      </w:pPr>
-    </w:p>
-    <w:p>
-      <w:pPr>
-        <w:rPr>
-          <w:rFonts w:ascii="Calibri" w:hAnsi="Calibri" w:cs="Calibri"/>
-          <w:b/>
-          <w:bCs/>
-        </w:rPr>
-      </w:pPr>
-    </w:p>
-    <w:p>
-      <w:pPr>
-        <w:rPr>
-          <w:rFonts w:ascii="Calibri" w:hAnsi="Calibri" w:cs="Calibri"/>
-          <w:b/>
-          <w:bCs/>
-        </w:rPr>
-      </w:pPr>
-    </w:p>
-    <w:p>
-      <w:pPr>
-        <w:rPr>
-          <w:rFonts w:ascii="Calibri" w:hAnsi="Calibri" w:cs="Calibri"/>
-          <w:b/>
-          <w:bCs/>
-        </w:rPr>
-      </w:pPr>
-    </w:p>
-    <w:p>
-      <w:pPr>
-        <w:rPr>
-          <w:rFonts w:ascii="Calibri" w:hAnsi="Calibri" w:cs="Calibri"/>
-          <w:b/>
-          <w:bCs/>
-        </w:rPr>
-      </w:pPr>
-    </w:p>
-    <w:p>
-      <w:pPr>
-        <w:rPr>
-          <w:rFonts w:ascii="Calibri" w:hAnsi="Calibri" w:cs="Calibri"/>
-          <w:b/>
-          <w:bCs/>
-        </w:rPr>
-      </w:pPr>
-    </w:p>
-    <w:p>
-      <w:pPr>
-        <w:rPr>
-          <w:rFonts w:ascii="Calibri" w:hAnsi="Calibri" w:cs="Calibri"/>
-          <w:b/>
-          <w:bCs/>
-        </w:rPr>
-      </w:pPr>
-    </w:p>
-    <w:p>
-      <w:pPr>
-        <w:rPr>
-          <w:rFonts w:ascii="Calibri" w:hAnsi="Calibri" w:cs="Calibri"/>
-          <w:b/>
-          <w:bCs/>
-        </w:rPr>
-      </w:pPr>
-    </w:p>
-    <w:p>
-      <w:pPr>
-        <w:rPr>
-          <w:rFonts w:ascii="Calibri" w:hAnsi="Calibri" w:cs="Calibri"/>
-          <w:b/>
-          <w:bCs/>
-        </w:rPr>
-      </w:pPr>
-    </w:p>
-    <w:p>
-      <w:pPr>
-        <w:rPr>
-          <w:rFonts w:ascii="Calibri" w:hAnsi="Calibri" w:cs="Calibri"/>
-          <w:b/>
-          <w:bCs/>
-        </w:rPr>
-      </w:pPr>
-    </w:p>
-    <w:p>
-      <w:pPr>
-        <w:rPr>
-          <w:rFonts w:ascii="Calibri" w:hAnsi="Calibri" w:cs="Calibri"/>
-          <w:b/>
-          <w:bCs/>
-        </w:rPr>
-      </w:pPr>
-      <w:r>
-        <w:rPr>
-          <w:rFonts w:ascii="Calibri" w:hAnsi="Calibri" w:cs="Calibri"/>
-          <w:b/>
-          <w:bCs/>
-        </w:rPr>
+      <w:r>
+        <w:rPr>
+          <w:rFonts w:ascii="Calibri" w:hAnsi="Calibri" w:cs="Calibri"/>
+          <w:b/>
+          <w:bCs/>
+        </w:rPr>
+        <w:t xml:space="preserve">     </w:t>
+      </w:r>
+      <w:r>
+        <w:rPr>
+          <w:rFonts w:ascii="Calibri" w:hAnsi="Calibri" w:cs="Calibri"/>
+          <w:b/>
+          <w:bCs/>
+        </w:rPr>
+        <w:t xml:space="preserve">                    </w:t>
+      </w:r>
+      <w:r>
+        <w:rPr>
+          <w:rFonts w:ascii="Calibri" w:hAnsi="Calibri" w:cs="Calibri"/>
+          <w:b/>
+          <w:bCs/>
+          <w:u w:val="single"/>
+        </w:rPr>
+        <w:t>Waveform.c</w:t>
+      </w:r>
+      <w:r>
+        <w:rPr>
+          <w:rFonts w:ascii="Calibri" w:hAnsi="Calibri" w:cs="Calibri"/>
+          <w:b/>
+          <w:bCs/>
+        </w:rPr>
+        <w:t xml:space="preserve">                                                                 </w:t>
+      </w:r>
+      <w:r>
+        <w:rPr>
+          <w:rFonts w:ascii="Calibri" w:hAnsi="Calibri" w:cs="Calibri"/>
+          <w:b/>
+          <w:bCs/>
+        </w:rPr>
+        <w:t xml:space="preserve">     </w:t>
+      </w:r>
+      <w:r>
+        <w:rPr>
+          <w:rFonts w:ascii="Calibri" w:hAnsi="Calibri" w:cs="Calibri"/>
+          <w:b/>
+          <w:bCs/>
+          <w:u w:val="single"/>
+        </w:rPr>
+        <w:t>io</w:t>
+      </w:r>
+      <w:r>
+        <w:rPr>
+          <w:rFonts w:ascii="Calibri" w:hAnsi="Calibri" w:cs="Calibri"/>
+          <w:b/>
+          <w:bCs/>
+          <w:u w:val="single"/>
+        </w:rPr>
+        <w:t>.c</w:t>
+      </w:r>
+    </w:p>
+    <w:p>
+      <w:pPr>
+        <w:rPr>
+          <w:rFonts w:ascii="Calibri" w:hAnsi="Calibri" w:cs="Calibri"/>
+          <w:b/>
+          <w:bCs/>
+        </w:rPr>
+      </w:pPr>
+      <w:r>
+        <w:rPr>
+          <w:noProof/>
+        </w:rPr>
+        <w:drawing>
+          <wp:anchor distT="0" distB="0" distL="114300" distR="114300" simplePos="0" relativeHeight="251661312" behindDoc="0" locked="0" layoutInCell="1" allowOverlap="1" wp14:anchorId="058B7CD9" wp14:editId="474A7B63">
+            <wp:simplePos x="0" y="0"/>
+            <wp:positionH relativeFrom="column">
+              <wp:posOffset>3391535</wp:posOffset>
+            </wp:positionH>
+            <wp:positionV relativeFrom="paragraph">
+              <wp:posOffset>175260</wp:posOffset>
+            </wp:positionV>
+            <wp:extent cx="3019425" cy="7751445"/>
+            <wp:effectExtent l="0" t="0" r="0" b="0"/>
+            <wp:wrapSquare wrapText="bothSides"/>
+            <wp:docPr id="1756851777" name="Picture 4"/>
+            <wp:cNvGraphicFramePr>
+              <a:graphicFrameLocks xmlns:a="http://schemas.openxmlformats.org/drawingml/2006/main" noChangeAspect="1"/>
+            </wp:cNvGraphicFramePr>
+            <a:graphic xmlns:a="http://schemas.openxmlformats.org/drawingml/2006/main">
+              <a:graphicData uri="http://schemas.openxmlformats.org/drawingml/2006/picture">
+                <pic:pic xmlns:pic="http://schemas.openxmlformats.org/drawingml/2006/picture">
+                  <pic:nvPicPr>
+                    <pic:cNvPr id="0" name="Picture 7"/>
+                    <pic:cNvPicPr>
+                      <a:picLocks noChangeAspect="1" noChangeArrowheads="1"/>
+                    </pic:cNvPicPr>
+                  </pic:nvPicPr>
+                  <pic:blipFill>
+                    <a:blip r:embed="rId10">
+                      <a:extLst>
+                        <a:ext uri="{28A0092B-C50C-407E-A947-70E740481C1C}">
+                          <a14:useLocalDpi xmlns:a14="http://schemas.microsoft.com/office/drawing/2010/main" val="0"/>
+                        </a:ext>
+                      </a:extLst>
+                    </a:blip>
+                    <a:srcRect/>
+                    <a:stretch>
+                      <a:fillRect/>
+                    </a:stretch>
+                  </pic:blipFill>
+                  <pic:spPr bwMode="auto">
+                    <a:xfrm>
+                      <a:off x="0" y="0"/>
+                      <a:ext cx="3019425" cy="7751445"/>
+                    </a:xfrm>
+                    <a:prstGeom prst="rect">
+                      <a:avLst/>
+                    </a:prstGeom>
+                    <a:noFill/>
+                    <a:ln>
+                      <a:noFill/>
+                    </a:ln>
+                  </pic:spPr>
+                </pic:pic>
+              </a:graphicData>
+            </a:graphic>
+            <wp14:sizeRelH relativeFrom="page">
+              <wp14:pctWidth>0</wp14:pctWidth>
+            </wp14:sizeRelH>
+            <wp14:sizeRelV relativeFrom="page">
+              <wp14:pctHeight>0</wp14:pctHeight>
+            </wp14:sizeRelV>
+          </wp:anchor>
+        </w:drawing>
+      </w:r>
+    </w:p>
+    <w:p>
+      <w:pPr>
+        <w:pStyle w:val="Heading2"/>
+      </w:pPr>
+    </w:p>
+    <w:p>
+      <w:pPr>
+        <w:rPr>
+          <w:lang w:eastAsia="en-US"/>
+        </w:rPr>
+      </w:pPr>
+    </w:p>
+    <w:p>
+      <w:pPr>
+        <w:pStyle w:val="Heading2"/>
+      </w:pPr>
+      <w:r>
+        <w:lastRenderedPageBreak/>
         <w:t>3. Function Description</w:t>
       </w:r>
     </w:p>
@@ -1623,6 +751,14 @@
           <w:rFonts w:ascii="Calibri" w:hAnsi="Calibri" w:cs="Calibri"/>
         </w:rPr>
         <w:t>Each function in the system is described below:</w:t>
+      </w:r>
+    </w:p>
+    <w:p>
+      <w:pPr>
+        <w:pStyle w:val="Heading3"/>
+      </w:pPr>
+      <w:r>
+        <w:t>Io.c</w:t>
       </w:r>
     </w:p>
     <w:p>
@@ -1641,23 +777,31 @@
           <w:b/>
           <w:bCs/>
         </w:rPr>
-        <w:t>Example</w:t>
-      </w:r>
-      <w:r>
-        <w:rPr>
-          <w:rFonts w:ascii="Calibri" w:hAnsi="Calibri" w:cs="Calibri"/>
-          <w:b/>
-          <w:bCs/>
-        </w:rPr>
-        <w:t xml:space="preserve"> Function</w:t>
-      </w:r>
-      <w:r>
-        <w:rPr>
-          <w:rFonts w:ascii="Calibri" w:hAnsi="Calibri" w:cs="Calibri"/>
-          <w:b/>
-          <w:bCs/>
-        </w:rPr>
-        <w:t>, version x.x</w:t>
+        <w:t>L</w:t>
+      </w:r>
+      <w:r>
+        <w:rPr>
+          <w:rFonts w:ascii="Calibri" w:hAnsi="Calibri" w:cs="Calibri"/>
+          <w:b/>
+          <w:bCs/>
+        </w:rPr>
+        <w:t>oadData(),</w:t>
+      </w:r>
+      <w:r>
+        <w:rPr>
+          <w:rFonts w:ascii="Calibri" w:hAnsi="Calibri" w:cs="Calibri"/>
+          <w:b/>
+          <w:bCs/>
+        </w:rPr>
+        <w:t xml:space="preserve"> version </w:t>
+      </w:r>
+      <w:r>
+        <w:rPr>
+          <w:rFonts w:ascii="Calibri" w:hAnsi="Calibri" w:cs="Calibri"/>
+          <w:b/>
+          <w:bCs/>
+        </w:rPr>
+        <w:t>1.0</w:t>
       </w:r>
     </w:p>
     <w:p>
@@ -1682,13 +826,13 @@
         <w:rPr>
           <w:rFonts w:ascii="Calibri" w:hAnsi="Calibri" w:cs="Calibri"/>
         </w:rPr>
-        <w:t xml:space="preserve"> The function </w:t>
-      </w:r>
-      <w:r>
-        <w:rPr>
-          <w:rFonts w:ascii="Calibri" w:hAnsi="Calibri" w:cs="Calibri"/>
-        </w:rPr>
-        <w:t>does….</w:t>
+        <w:t xml:space="preserve"> </w:t>
+      </w:r>
+      <w:r>
+        <w:rPr>
+          <w:rFonts w:ascii="Calibri" w:hAnsi="Calibri" w:cs="Calibri"/>
+        </w:rPr>
+        <w:t>This function does the everything to load and store the file in a structure of arrays. First, it attempts to open the given file and returns an error if it isn’t able, then uses fgets() to count the number of rows and skips the header. Next, it allocates memory equal to the size of the function defined and sets a pointer to that memory. Finally, it loops through each line, splitting each value at the delimiter, and stores it in its respective variable in the function.</w:t>
       </w:r>
     </w:p>
     <w:p>
@@ -1721,7 +865,13 @@
         <w:rPr>
           <w:rFonts w:ascii="Calibri" w:hAnsi="Calibri" w:cs="Calibri"/>
         </w:rPr>
-        <w:t>: List acceptable data types and ranges here and order.</w:t>
+        <w:t xml:space="preserve">: </w:t>
+      </w:r>
+      <w:r>
+        <w:rPr>
+          <w:rFonts w:ascii="Calibri" w:hAnsi="Calibri" w:cs="Calibri"/>
+        </w:rPr>
+        <w:t>fname (Character array)</w:t>
       </w:r>
     </w:p>
     <w:p>
@@ -1752,23 +902,695 @@
         <w:rPr>
           <w:rFonts w:ascii="Calibri" w:hAnsi="Calibri" w:cs="Calibri"/>
         </w:rPr>
-        <w:t>What the output returns, and where applicable, what it means.</w:t>
-      </w:r>
-    </w:p>
-    <w:p>
-      <w:pPr>
-        <w:rPr>
-          <w:rFonts w:ascii="Calibri" w:hAnsi="Calibri" w:cs="Calibri"/>
-          <w:b/>
-          <w:bCs/>
-        </w:rPr>
-      </w:pPr>
-      <w:r>
-        <w:rPr>
-          <w:rFonts w:ascii="Calibri" w:hAnsi="Calibri" w:cs="Calibri"/>
-          <w:b/>
-          <w:bCs/>
-        </w:rPr>
+        <w:t>Returns a structure of arrays holding all data from the csv besides the header.</w:t>
+      </w:r>
+    </w:p>
+    <w:p>
+      <w:pPr>
+        <w:pStyle w:val="Heading3"/>
+      </w:pPr>
+      <w:r>
+        <w:t>Waveform.c</w:t>
+      </w:r>
+    </w:p>
+    <w:p>
+      <w:pPr>
+        <w:pStyle w:val="ListParagraph"/>
+        <w:numPr>
+          <w:ilvl w:val="0"/>
+          <w:numId w:val="12"/>
+        </w:numPr>
+        <w:rPr>
+          <w:b/>
+          <w:bCs/>
+        </w:rPr>
+      </w:pPr>
+      <w:r>
+        <w:rPr>
+          <w:b/>
+          <w:bCs/>
+        </w:rPr>
+        <w:t>WaveFormCalculations(), version 1.5</w:t>
+      </w:r>
+    </w:p>
+    <w:p>
+      <w:pPr>
+        <w:pStyle w:val="ListParagraph"/>
+        <w:numPr>
+          <w:ilvl w:val="1"/>
+          <w:numId w:val="12"/>
+        </w:numPr>
+        <w:rPr>
+          <w:b/>
+          <w:bCs/>
+        </w:rPr>
+      </w:pPr>
+      <w:r>
+        <w:rPr>
+          <w:b/>
+          <w:bCs/>
+        </w:rPr>
+        <w:t xml:space="preserve">Description: </w:t>
+      </w:r>
+      <w:r>
+        <w:t>Creates variables equal to the returning result of several functions. Checks the compliance of each phase and whether the values in each phase clip or not.</w:t>
+      </w:r>
+      <w:r>
+        <w:rPr>
+          <w:b/>
+          <w:bCs/>
+        </w:rPr>
+        <w:t xml:space="preserve"> </w:t>
+      </w:r>
+      <w:r>
+        <w:t>Finally, it opens a new text file and appends all the data in a neat table.</w:t>
+      </w:r>
+    </w:p>
+    <w:p>
+      <w:pPr>
+        <w:pStyle w:val="ListParagraph"/>
+        <w:numPr>
+          <w:ilvl w:val="1"/>
+          <w:numId w:val="12"/>
+        </w:numPr>
+        <w:rPr>
+          <w:b/>
+          <w:bCs/>
+        </w:rPr>
+      </w:pPr>
+      <w:r>
+        <w:rPr>
+          <w:b/>
+          <w:bCs/>
+        </w:rPr>
+        <w:t xml:space="preserve">Input Parameters: </w:t>
+      </w:r>
+      <w:r>
+        <w:t>dataArray (Pointer to WaveFormData Structure)</w:t>
+      </w:r>
+    </w:p>
+    <w:p>
+      <w:pPr>
+        <w:pStyle w:val="ListParagraph"/>
+        <w:numPr>
+          <w:ilvl w:val="1"/>
+          <w:numId w:val="12"/>
+        </w:numPr>
+        <w:rPr>
+          <w:b/>
+          <w:bCs/>
+        </w:rPr>
+      </w:pPr>
+      <w:r>
+        <w:rPr>
+          <w:b/>
+          <w:bCs/>
+        </w:rPr>
+        <w:t xml:space="preserve">Returns: </w:t>
+      </w:r>
+      <w:r>
+        <w:t>Nothing, void function</w:t>
+      </w:r>
+    </w:p>
+    <w:p>
+      <w:pPr>
+        <w:pStyle w:val="ListParagraph"/>
+        <w:numPr>
+          <w:ilvl w:val="0"/>
+          <w:numId w:val="12"/>
+        </w:numPr>
+        <w:rPr>
+          <w:b/>
+          <w:bCs/>
+        </w:rPr>
+      </w:pPr>
+      <w:r>
+        <w:rPr>
+          <w:b/>
+          <w:bCs/>
+        </w:rPr>
+        <w:t>RMS(), version 1.0</w:t>
+      </w:r>
+    </w:p>
+    <w:p>
+      <w:pPr>
+        <w:pStyle w:val="ListParagraph"/>
+        <w:numPr>
+          <w:ilvl w:val="1"/>
+          <w:numId w:val="12"/>
+        </w:numPr>
+        <w:rPr>
+          <w:b/>
+          <w:bCs/>
+        </w:rPr>
+      </w:pPr>
+      <w:r>
+        <w:rPr>
+          <w:b/>
+          <w:bCs/>
+        </w:rPr>
+        <w:t xml:space="preserve">Description: </w:t>
+      </w:r>
+      <w:r>
+        <w:t>Sets a pointer equal to the inputted phase array, loops through that array, summing the square of each value the pointer currently points to. Lastly, it returns the square root of the mean of the summed values.</w:t>
+      </w:r>
+    </w:p>
+    <w:p>
+      <w:pPr>
+        <w:pStyle w:val="ListParagraph"/>
+        <w:numPr>
+          <w:ilvl w:val="1"/>
+          <w:numId w:val="12"/>
+        </w:numPr>
+        <w:rPr>
+          <w:b/>
+          <w:bCs/>
+        </w:rPr>
+      </w:pPr>
+      <w:r>
+        <w:rPr>
+          <w:b/>
+          <w:bCs/>
+        </w:rPr>
+        <w:t>Input Parameters</w:t>
+      </w:r>
+      <w:r>
+        <w:rPr>
+          <w:b/>
+          <w:bCs/>
+        </w:rPr>
+        <w:t xml:space="preserve">: </w:t>
+      </w:r>
+      <w:r>
+        <w:t>vol</w:t>
+      </w:r>
+      <w:r>
+        <w:t xml:space="preserve"> (Pointer to array), size(Integer)</w:t>
+      </w:r>
+    </w:p>
+    <w:p>
+      <w:pPr>
+        <w:pStyle w:val="ListParagraph"/>
+        <w:numPr>
+          <w:ilvl w:val="1"/>
+          <w:numId w:val="12"/>
+        </w:numPr>
+        <w:rPr>
+          <w:b/>
+          <w:bCs/>
+        </w:rPr>
+      </w:pPr>
+      <w:r>
+        <w:rPr>
+          <w:b/>
+          <w:bCs/>
+        </w:rPr>
+        <w:t>Returns:</w:t>
+      </w:r>
+      <w:r>
+        <w:rPr>
+          <w:b/>
+          <w:bCs/>
+        </w:rPr>
+        <w:t xml:space="preserve"> </w:t>
+      </w:r>
+      <w:r>
+        <w:t>The root mean squared</w:t>
+      </w:r>
+    </w:p>
+    <w:p>
+      <w:pPr>
+        <w:pStyle w:val="ListParagraph"/>
+        <w:numPr>
+          <w:ilvl w:val="0"/>
+          <w:numId w:val="12"/>
+        </w:numPr>
+        <w:rPr>
+          <w:b/>
+          <w:bCs/>
+        </w:rPr>
+      </w:pPr>
+      <w:r>
+        <w:rPr>
+          <w:b/>
+          <w:bCs/>
+        </w:rPr>
+        <w:t>PeakToPeak(), version 1.0</w:t>
+      </w:r>
+    </w:p>
+    <w:p>
+      <w:pPr>
+        <w:pStyle w:val="ListParagraph"/>
+        <w:numPr>
+          <w:ilvl w:val="1"/>
+          <w:numId w:val="12"/>
+        </w:numPr>
+        <w:rPr>
+          <w:b/>
+          <w:bCs/>
+        </w:rPr>
+      </w:pPr>
+      <w:r>
+        <w:rPr>
+          <w:b/>
+          <w:bCs/>
+        </w:rPr>
+        <w:t>Description:</w:t>
+      </w:r>
+      <w:r>
+        <w:rPr>
+          <w:b/>
+          <w:bCs/>
+        </w:rPr>
+        <w:t xml:space="preserve"> </w:t>
+      </w:r>
+      <w:r>
+        <w:t>Again, using pointer indexing, it loops through each value twice finding firstly the maximum of the samples, and then the minimum. Next it declares a variable equal to the difference of the two values respectively and returns this value.</w:t>
+      </w:r>
+    </w:p>
+    <w:p>
+      <w:pPr>
+        <w:pStyle w:val="ListParagraph"/>
+        <w:numPr>
+          <w:ilvl w:val="1"/>
+          <w:numId w:val="12"/>
+        </w:numPr>
+        <w:rPr>
+          <w:b/>
+          <w:bCs/>
+        </w:rPr>
+      </w:pPr>
+      <w:r>
+        <w:rPr>
+          <w:b/>
+          <w:bCs/>
+        </w:rPr>
+        <w:t>Input Parameters</w:t>
+      </w:r>
+      <w:r>
+        <w:rPr>
+          <w:b/>
+          <w:bCs/>
+        </w:rPr>
+        <w:t xml:space="preserve">: </w:t>
+      </w:r>
+      <w:r>
+        <w:t>vol</w:t>
+      </w:r>
+      <w:r>
+        <w:t xml:space="preserve"> (Pointer to array), size(Integer)</w:t>
+      </w:r>
+    </w:p>
+    <w:p>
+      <w:pPr>
+        <w:pStyle w:val="ListParagraph"/>
+        <w:numPr>
+          <w:ilvl w:val="1"/>
+          <w:numId w:val="12"/>
+        </w:numPr>
+        <w:rPr>
+          <w:b/>
+          <w:bCs/>
+        </w:rPr>
+      </w:pPr>
+      <w:r>
+        <w:rPr>
+          <w:b/>
+          <w:bCs/>
+        </w:rPr>
+        <w:t>Returns:</w:t>
+      </w:r>
+      <w:r>
+        <w:rPr>
+          <w:b/>
+          <w:bCs/>
+        </w:rPr>
+        <w:t xml:space="preserve"> </w:t>
+      </w:r>
+      <w:r>
+        <w:t>Difference between max and min samples</w:t>
+      </w:r>
+    </w:p>
+    <w:p>
+      <w:pPr>
+        <w:pStyle w:val="ListParagraph"/>
+        <w:numPr>
+          <w:ilvl w:val="0"/>
+          <w:numId w:val="12"/>
+        </w:numPr>
+        <w:rPr>
+          <w:b/>
+          <w:bCs/>
+        </w:rPr>
+      </w:pPr>
+      <w:r>
+        <w:rPr>
+          <w:b/>
+          <w:bCs/>
+        </w:rPr>
+        <w:t>DetectClipping(), version 1.0</w:t>
+      </w:r>
+    </w:p>
+    <w:p>
+      <w:pPr>
+        <w:pStyle w:val="ListParagraph"/>
+        <w:numPr>
+          <w:ilvl w:val="1"/>
+          <w:numId w:val="12"/>
+        </w:numPr>
+      </w:pPr>
+      <w:r>
+        <w:rPr>
+          <w:b/>
+          <w:bCs/>
+        </w:rPr>
+        <w:t>Description:</w:t>
+      </w:r>
+      <w:r>
+        <w:rPr>
+          <w:b/>
+          <w:bCs/>
+        </w:rPr>
+        <w:t xml:space="preserve"> </w:t>
+      </w:r>
+      <w:r>
+        <w:t>Loops through the array</w:t>
+      </w:r>
+      <w:r>
+        <w:t>, checking for each value whether it is greater than or equal to 324.9 (The limit of the sensor).</w:t>
+      </w:r>
+    </w:p>
+    <w:p>
+      <w:pPr>
+        <w:pStyle w:val="ListParagraph"/>
+        <w:numPr>
+          <w:ilvl w:val="1"/>
+          <w:numId w:val="12"/>
+        </w:numPr>
+        <w:rPr>
+          <w:b/>
+          <w:bCs/>
+        </w:rPr>
+      </w:pPr>
+      <w:r>
+        <w:rPr>
+          <w:b/>
+          <w:bCs/>
+        </w:rPr>
+        <w:t>Input Parameters</w:t>
+      </w:r>
+      <w:r>
+        <w:rPr>
+          <w:b/>
+          <w:bCs/>
+        </w:rPr>
+        <w:t xml:space="preserve">: </w:t>
+      </w:r>
+      <w:r>
+        <w:t>vol</w:t>
+      </w:r>
+      <w:r>
+        <w:t xml:space="preserve"> (Pointer to array), size(Integer)</w:t>
+      </w:r>
+    </w:p>
+    <w:p>
+      <w:pPr>
+        <w:pStyle w:val="ListParagraph"/>
+        <w:numPr>
+          <w:ilvl w:val="1"/>
+          <w:numId w:val="12"/>
+        </w:numPr>
+        <w:rPr>
+          <w:b/>
+          <w:bCs/>
+        </w:rPr>
+      </w:pPr>
+      <w:r>
+        <w:rPr>
+          <w:b/>
+          <w:bCs/>
+        </w:rPr>
+        <w:lastRenderedPageBreak/>
+        <w:t>Returns:</w:t>
+      </w:r>
+      <w:r>
+        <w:rPr>
+          <w:b/>
+          <w:bCs/>
+        </w:rPr>
+        <w:t xml:space="preserve"> </w:t>
+      </w:r>
+      <w:r>
+        <w:t>Either false or true depending upon the value</w:t>
+      </w:r>
+    </w:p>
+    <w:p>
+      <w:pPr>
+        <w:pStyle w:val="ListParagraph"/>
+        <w:numPr>
+          <w:ilvl w:val="0"/>
+          <w:numId w:val="12"/>
+        </w:numPr>
+        <w:rPr>
+          <w:b/>
+          <w:bCs/>
+        </w:rPr>
+      </w:pPr>
+      <w:r>
+        <w:rPr>
+          <w:b/>
+          <w:bCs/>
+        </w:rPr>
+        <w:t>VarianceCalc(), version 1.0</w:t>
+      </w:r>
+    </w:p>
+    <w:p>
+      <w:pPr>
+        <w:pStyle w:val="ListParagraph"/>
+        <w:numPr>
+          <w:ilvl w:val="1"/>
+          <w:numId w:val="12"/>
+        </w:numPr>
+        <w:rPr>
+          <w:b/>
+          <w:bCs/>
+        </w:rPr>
+      </w:pPr>
+      <w:r>
+        <w:rPr>
+          <w:b/>
+          <w:bCs/>
+        </w:rPr>
+        <w:t>Description:</w:t>
+      </w:r>
+      <w:r>
+        <w:rPr>
+          <w:b/>
+          <w:bCs/>
+        </w:rPr>
+        <w:t xml:space="preserve"> </w:t>
+      </w:r>
+      <w:r>
+        <w:t xml:space="preserve">Uses the Mean function to calculate the mean, sets a pointer to the inputted array and then loops through said array summing the absolute value of the current value – the mean, squared. </w:t>
+      </w:r>
+    </w:p>
+    <w:p>
+      <w:pPr>
+        <w:pStyle w:val="ListParagraph"/>
+        <w:numPr>
+          <w:ilvl w:val="1"/>
+          <w:numId w:val="12"/>
+        </w:numPr>
+        <w:rPr>
+          <w:b/>
+          <w:bCs/>
+        </w:rPr>
+      </w:pPr>
+      <w:r>
+        <w:rPr>
+          <w:b/>
+          <w:bCs/>
+        </w:rPr>
+        <w:t>Input Parameters</w:t>
+      </w:r>
+      <w:r>
+        <w:rPr>
+          <w:b/>
+          <w:bCs/>
+        </w:rPr>
+        <w:t xml:space="preserve">: </w:t>
+      </w:r>
+      <w:r>
+        <w:t>vol</w:t>
+      </w:r>
+      <w:r>
+        <w:t xml:space="preserve"> (Pointer to array), size(Integer)</w:t>
+      </w:r>
+    </w:p>
+    <w:p>
+      <w:pPr>
+        <w:pStyle w:val="ListParagraph"/>
+        <w:numPr>
+          <w:ilvl w:val="1"/>
+          <w:numId w:val="12"/>
+        </w:numPr>
+        <w:rPr>
+          <w:b/>
+          <w:bCs/>
+        </w:rPr>
+      </w:pPr>
+      <w:r>
+        <w:rPr>
+          <w:b/>
+          <w:bCs/>
+        </w:rPr>
+        <w:t>Returns:</w:t>
+      </w:r>
+      <w:r>
+        <w:rPr>
+          <w:b/>
+          <w:bCs/>
+        </w:rPr>
+        <w:t xml:space="preserve"> </w:t>
+      </w:r>
+      <w:r>
+        <w:t>The sum of the loop divided by the size of the array</w:t>
+      </w:r>
+    </w:p>
+    <w:p>
+      <w:pPr>
+        <w:pStyle w:val="ListParagraph"/>
+        <w:numPr>
+          <w:ilvl w:val="0"/>
+          <w:numId w:val="12"/>
+        </w:numPr>
+        <w:rPr>
+          <w:b/>
+          <w:bCs/>
+        </w:rPr>
+      </w:pPr>
+      <w:r>
+        <w:rPr>
+          <w:b/>
+          <w:bCs/>
+        </w:rPr>
+        <w:t>Mean(), version 1.0</w:t>
+      </w:r>
+    </w:p>
+    <w:p>
+      <w:pPr>
+        <w:pStyle w:val="ListParagraph"/>
+        <w:numPr>
+          <w:ilvl w:val="1"/>
+          <w:numId w:val="12"/>
+        </w:numPr>
+        <w:rPr>
+          <w:b/>
+          <w:bCs/>
+        </w:rPr>
+      </w:pPr>
+      <w:r>
+        <w:rPr>
+          <w:b/>
+          <w:bCs/>
+        </w:rPr>
+        <w:t>Description:</w:t>
+      </w:r>
+      <w:r>
+        <w:rPr>
+          <w:b/>
+          <w:bCs/>
+        </w:rPr>
+        <w:t xml:space="preserve"> </w:t>
+      </w:r>
+      <w:r>
+        <w:t>Sets a pointer equal to the value of each phase array then loops through that array using pointers instead of array indexing summing each value. After that, it divides by the size of the array to return the mean</w:t>
+      </w:r>
+    </w:p>
+    <w:p>
+      <w:pPr>
+        <w:pStyle w:val="ListParagraph"/>
+        <w:numPr>
+          <w:ilvl w:val="1"/>
+          <w:numId w:val="12"/>
+        </w:numPr>
+        <w:rPr>
+          <w:b/>
+          <w:bCs/>
+        </w:rPr>
+      </w:pPr>
+      <w:r>
+        <w:rPr>
+          <w:b/>
+          <w:bCs/>
+        </w:rPr>
+        <w:t>Input Parameters</w:t>
+      </w:r>
+      <w:r>
+        <w:rPr>
+          <w:b/>
+          <w:bCs/>
+        </w:rPr>
+        <w:t xml:space="preserve">: </w:t>
+      </w:r>
+      <w:r>
+        <w:t>vol</w:t>
+      </w:r>
+      <w:r>
+        <w:t xml:space="preserve"> (Pointer to array), size(Integer)</w:t>
+      </w:r>
+    </w:p>
+    <w:p>
+      <w:pPr>
+        <w:pStyle w:val="ListParagraph"/>
+        <w:numPr>
+          <w:ilvl w:val="1"/>
+          <w:numId w:val="12"/>
+        </w:numPr>
+      </w:pPr>
+      <w:r>
+        <w:rPr>
+          <w:b/>
+          <w:bCs/>
+        </w:rPr>
+        <w:t>Returns</w:t>
+      </w:r>
+      <w:r>
+        <w:t>:</w:t>
+      </w:r>
+      <w:r>
+        <w:t xml:space="preserve"> The mean</w:t>
+      </w:r>
+    </w:p>
+    <w:p>
+      <w:pPr>
+        <w:pStyle w:val="ListParagraph"/>
+        <w:ind w:left="1440"/>
+        <w:rPr>
+          <w:b/>
+          <w:bCs/>
+        </w:rPr>
+      </w:pPr>
+    </w:p>
+    <w:p>
+      <w:pPr>
+        <w:pStyle w:val="ListParagraph"/>
+        <w:rPr>
+          <w:b/>
+          <w:bCs/>
+        </w:rPr>
+      </w:pPr>
+    </w:p>
+    <w:p>
+      <w:pPr>
+        <w:pStyle w:val="Heading2"/>
+      </w:pPr>
+    </w:p>
+    <w:p>
+      <w:pPr>
+        <w:pStyle w:val="Heading2"/>
+      </w:pPr>
+      <w:r>
         <w:t>4. Evidence of Unit Testing</w:t>
       </w:r>
     </w:p>
@@ -1784,23 +1606,23 @@
           <w:b/>
           <w:bCs/>
         </w:rPr>
-        <w:t>Unit Testing Function</w:t>
-      </w:r>
-      <w:r>
-        <w:rPr>
-          <w:rFonts w:ascii="Calibri" w:hAnsi="Calibri" w:cs="Calibri"/>
-          <w:b/>
-          <w:bCs/>
-        </w:rPr>
-        <w:t xml:space="preserve"> Name Version X.X</w:t>
-      </w:r>
-      <w:r>
-        <w:rPr>
-          <w:rFonts w:ascii="Calibri" w:hAnsi="Calibri" w:cs="Calibri"/>
-          <w:b/>
-          <w:bCs/>
-        </w:rPr>
-        <w:t>:</w:t>
+        <w:t xml:space="preserve">Unit Testing </w:t>
+      </w:r>
+      <w:r>
+        <w:rPr>
+          <w:rFonts w:ascii="Calibri" w:hAnsi="Calibri" w:cs="Calibri"/>
+          <w:b/>
+          <w:bCs/>
+        </w:rPr>
+        <w:t>main</w:t>
+      </w:r>
+      <w:r>
+        <w:rPr>
+          <w:rFonts w:ascii="Calibri" w:hAnsi="Calibri" w:cs="Calibri"/>
+          <w:b/>
+          <w:bCs/>
+        </w:rPr>
+        <w:t>.c:</w:t>
       </w:r>
     </w:p>
     <w:p>
@@ -1850,7 +1672,7 @@
         <w:rPr>
           <w:rFonts w:ascii="Calibri" w:hAnsi="Calibri" w:cs="Calibri"/>
         </w:rPr>
-        <w:t>data types and numbers</w:t>
+        <w:t>No input / Invalid file</w:t>
       </w:r>
     </w:p>
     <w:p>
@@ -1875,7 +1697,13 @@
         <w:rPr>
           <w:rFonts w:ascii="Calibri" w:hAnsi="Calibri" w:cs="Calibri"/>
         </w:rPr>
-        <w:t xml:space="preserve"> 80.0</w:t>
+        <w:t xml:space="preserve"> </w:t>
+      </w:r>
+      <w:r>
+        <w:rPr>
+          <w:rFonts w:ascii="Calibri" w:hAnsi="Calibri" w:cs="Calibri"/>
+        </w:rPr>
+        <w:t>“No valid file entered”</w:t>
       </w:r>
     </w:p>
     <w:p>
@@ -1905,6 +1733,7 @@
     </w:p>
     <w:p>
       <w:pPr>
+        <w:pStyle w:val="ListParagraph"/>
         <w:numPr>
           <w:ilvl w:val="0"/>
           <w:numId w:val="2"/>
@@ -1919,30 +1748,156 @@
           <w:b/>
           <w:bCs/>
         </w:rPr>
-        <w:t xml:space="preserve">Test Case </w:t>
-      </w:r>
-      <w:r>
-        <w:rPr>
-          <w:rFonts w:ascii="Calibri" w:hAnsi="Calibri" w:cs="Calibri"/>
-          <w:b/>
-          <w:bCs/>
-        </w:rPr>
-        <w:t>n</w:t>
-      </w:r>
-      <w:r>
-        <w:rPr>
-          <w:rFonts w:ascii="Calibri" w:hAnsi="Calibri" w:cs="Calibri"/>
-          <w:b/>
-          <w:bCs/>
-        </w:rPr>
-        <w:t>:</w:t>
-      </w:r>
-      <w:r>
-        <w:rPr>
-          <w:rFonts w:ascii="Calibri" w:hAnsi="Calibri" w:cs="Calibri"/>
-        </w:rPr>
-        <w:t xml:space="preserve"> (repeat as needed)</w:t>
-      </w:r>
+        <w:t>Test case 2</w:t>
+      </w:r>
+    </w:p>
+    <w:p>
+      <w:pPr>
+        <w:pStyle w:val="ListParagraph"/>
+        <w:numPr>
+          <w:ilvl w:val="1"/>
+          <w:numId w:val="2"/>
+        </w:numPr>
+        <w:rPr>
+          <w:rFonts w:ascii="Calibri" w:hAnsi="Calibri" w:cs="Calibri"/>
+        </w:rPr>
+      </w:pPr>
+      <w:r>
+        <w:rPr>
+          <w:rFonts w:ascii="Calibri" w:hAnsi="Calibri" w:cs="Calibri"/>
+          <w:b/>
+          <w:bCs/>
+        </w:rPr>
+        <w:t xml:space="preserve">Input: </w:t>
+      </w:r>
+      <w:r>
+        <w:rPr>
+          <w:rFonts w:ascii="Calibri" w:hAnsi="Calibri" w:cs="Calibri"/>
+        </w:rPr>
+        <w:t>CSV in different format to power_quality_log.csv</w:t>
+      </w:r>
+    </w:p>
+    <w:p>
+      <w:pPr>
+        <w:pStyle w:val="ListParagraph"/>
+        <w:numPr>
+          <w:ilvl w:val="1"/>
+          <w:numId w:val="2"/>
+        </w:numPr>
+        <w:rPr>
+          <w:rFonts w:ascii="Calibri" w:hAnsi="Calibri" w:cs="Calibri"/>
+        </w:rPr>
+      </w:pPr>
+      <w:r>
+        <w:rPr>
+          <w:rFonts w:ascii="Calibri" w:hAnsi="Calibri" w:cs="Calibri"/>
+          <w:b/>
+          <w:bCs/>
+        </w:rPr>
+        <w:t xml:space="preserve">Expected Output: </w:t>
+      </w:r>
+      <w:r>
+        <w:rPr>
+          <w:rFonts w:ascii="Calibri" w:hAnsi="Calibri" w:cs="Calibri"/>
+        </w:rPr>
+        <w:t>“No valid file entered”</w:t>
+      </w:r>
+    </w:p>
+    <w:p>
+      <w:pPr>
+        <w:pStyle w:val="ListParagraph"/>
+        <w:numPr>
+          <w:ilvl w:val="1"/>
+          <w:numId w:val="2"/>
+        </w:numPr>
+        <w:rPr>
+          <w:rFonts w:ascii="Calibri" w:hAnsi="Calibri" w:cs="Calibri"/>
+        </w:rPr>
+      </w:pPr>
+      <w:r>
+        <w:rPr>
+          <w:rFonts w:ascii="Calibri" w:hAnsi="Calibri" w:cs="Calibri"/>
+          <w:b/>
+          <w:bCs/>
+        </w:rPr>
+        <w:t xml:space="preserve">Result: </w:t>
+      </w:r>
+      <w:r>
+        <w:rPr>
+          <w:rFonts w:ascii="Calibri" w:hAnsi="Calibri" w:cs="Calibri"/>
+        </w:rPr>
+        <w:t>Failed</w:t>
+      </w:r>
+    </w:p>
+    <w:p>
+      <w:pPr>
+        <w:pStyle w:val="ListParagraph"/>
+        <w:numPr>
+          <w:ilvl w:val="1"/>
+          <w:numId w:val="2"/>
+        </w:numPr>
+        <w:rPr>
+          <w:rFonts w:ascii="Calibri" w:hAnsi="Calibri" w:cs="Calibri"/>
+        </w:rPr>
+      </w:pPr>
+      <w:r>
+        <w:rPr>
+          <w:rFonts w:ascii="Calibri" w:hAnsi="Calibri" w:cs="Calibri"/>
+          <w:b/>
+          <w:bCs/>
+        </w:rPr>
+        <w:t>Fix:</w:t>
+      </w:r>
+      <w:r>
+        <w:rPr>
+          <w:rFonts w:ascii="Calibri" w:hAnsi="Calibri" w:cs="Calibri"/>
+        </w:rPr>
+        <w:t xml:space="preserve"> </w:t>
+      </w:r>
+      <w:r>
+        <w:rPr>
+          <w:rFonts w:ascii="Calibri" w:hAnsi="Calibri" w:cs="Calibri"/>
+        </w:rPr>
+        <w:t>Before creating the structure in io.c, it checks the header to make sure that all three phase voltages are there, if not it will return an error message and close. I also added a case inside the loop to store the data so that after each line it will check if the data count is equal to 8, if not the program returns an error message and closes.</w:t>
+      </w:r>
+    </w:p>
+    <w:p>
+      <w:pPr>
+        <w:pStyle w:val="ListParagraph"/>
+        <w:numPr>
+          <w:ilvl w:val="1"/>
+          <w:numId w:val="2"/>
+        </w:numPr>
+        <w:rPr>
+          <w:rFonts w:ascii="Calibri" w:hAnsi="Calibri" w:cs="Calibri"/>
+        </w:rPr>
+      </w:pPr>
+      <w:r>
+        <w:rPr>
+          <w:rFonts w:ascii="Calibri" w:hAnsi="Calibri" w:cs="Calibri"/>
+          <w:b/>
+          <w:bCs/>
+        </w:rPr>
+        <w:t>New result:</w:t>
+      </w:r>
+      <w:r>
+        <w:rPr>
+          <w:rFonts w:ascii="Calibri" w:hAnsi="Calibri" w:cs="Calibri"/>
+        </w:rPr>
+        <w:t xml:space="preserve"> Passed</w:t>
+      </w:r>
+    </w:p>
+    <w:p>
+      <w:pPr>
+        <w:pStyle w:val="ListParagraph"/>
+        <w:numPr>
+          <w:ilvl w:val="1"/>
+          <w:numId w:val="2"/>
+        </w:numPr>
+        <w:rPr>
+          <w:rFonts w:ascii="Calibri" w:hAnsi="Calibri" w:cs="Calibri"/>
+        </w:rPr>
+      </w:pPr>
     </w:p>
     <w:p>
       <w:pPr>
@@ -1973,7 +1928,19 @@
         <w:rPr>
           <w:rFonts w:ascii="Calibri" w:hAnsi="Calibri" w:cs="Calibri"/>
         </w:rPr>
-        <w:t>General description, any issues remaining?</w:t>
+        <w:t xml:space="preserve">Now that there is a case for every type of input I can currently think of, the program should be </w:t>
+      </w:r>
+      <w:r>
+        <w:rPr>
+          <w:rFonts w:ascii="Calibri" w:hAnsi="Calibri" w:cs="Calibri"/>
+        </w:rPr>
+        <w:t>robust</w:t>
+      </w:r>
+      <w:r>
+        <w:rPr>
+          <w:rFonts w:ascii="Calibri" w:hAnsi="Calibri" w:cs="Calibri"/>
+        </w:rPr>
+        <w:t>.</w:t>
       </w:r>
     </w:p>
     <w:p>
@@ -2038,16 +2005,19 @@
       <w:pPr>
         <w:rPr>
           <w:rFonts w:ascii="Calibri" w:hAnsi="Calibri" w:cs="Calibri"/>
-          <w:b/>
-          <w:bCs/>
-        </w:rPr>
-      </w:pPr>
-      <w:r>
-        <w:rPr>
-          <w:rFonts w:ascii="Calibri" w:hAnsi="Calibri" w:cs="Calibri"/>
-          <w:b/>
-          <w:bCs/>
-        </w:rPr>
+        </w:rPr>
+      </w:pPr>
+    </w:p>
+    <w:p>
+      <w:pPr>
+        <w:pStyle w:val="Heading2"/>
+      </w:pPr>
+    </w:p>
+    <w:p>
+      <w:pPr>
+        <w:pStyle w:val="Heading2"/>
+      </w:pPr>
+      <w:r>
         <w:t>5. Evidence of Integration Testing</w:t>
       </w:r>
     </w:p>
@@ -2270,32 +2240,27 @@
       <w:pPr>
         <w:rPr>
           <w:rFonts w:ascii="Calibri" w:hAnsi="Calibri" w:cs="Calibri"/>
-          <w:b/>
-          <w:bCs/>
-        </w:rPr>
-      </w:pPr>
-      <w:r>
-        <w:rPr>
-          <w:rFonts w:ascii="Calibri" w:hAnsi="Calibri" w:cs="Calibri"/>
-          <w:b/>
-          <w:bCs/>
-        </w:rPr>
+        </w:rPr>
+      </w:pPr>
+    </w:p>
+    <w:p>
+      <w:pPr>
+        <w:rPr>
+          <w:rFonts w:ascii="Calibri" w:hAnsi="Calibri" w:cs="Calibri"/>
+        </w:rPr>
+      </w:pPr>
+    </w:p>
+    <w:p>
+      <w:pPr>
+        <w:pStyle w:val="Heading2"/>
+      </w:pPr>
+      <w:r>
         <w:t xml:space="preserve">5. Evidence of </w:t>
       </w:r>
       <w:r>
-        <w:rPr>
-          <w:rFonts w:ascii="Calibri" w:hAnsi="Calibri" w:cs="Calibri"/>
-          <w:b/>
-          <w:bCs/>
-        </w:rPr>
         <w:t xml:space="preserve">Scenario </w:t>
       </w:r>
       <w:r>
-        <w:rPr>
-          <w:rFonts w:ascii="Calibri" w:hAnsi="Calibri" w:cs="Calibri"/>
-          <w:b/>
-          <w:bCs/>
-        </w:rPr>
         <w:t>Testing</w:t>
       </w:r>
     </w:p>
@@ -2483,18 +2448,25 @@
     </w:p>
     <w:p>
       <w:pPr>
-        <w:rPr>
-          <w:rFonts w:ascii="Calibri" w:hAnsi="Calibri" w:cs="Calibri"/>
-          <w:b/>
-          <w:bCs/>
-        </w:rPr>
-      </w:pPr>
-      <w:r>
-        <w:rPr>
-          <w:rFonts w:ascii="Calibri" w:hAnsi="Calibri" w:cs="Calibri"/>
-          <w:b/>
-          <w:bCs/>
-        </w:rPr>
+        <w:ind w:left="2160"/>
+        <w:rPr>
+          <w:rFonts w:ascii="Calibri" w:hAnsi="Calibri" w:cs="Calibri"/>
+        </w:rPr>
+      </w:pPr>
+    </w:p>
+    <w:p>
+      <w:pPr>
+        <w:ind w:left="2160"/>
+        <w:rPr>
+          <w:rFonts w:ascii="Calibri" w:hAnsi="Calibri" w:cs="Calibri"/>
+        </w:rPr>
+      </w:pPr>
+    </w:p>
+    <w:p>
+      <w:pPr>
+        <w:pStyle w:val="Heading2"/>
+      </w:pPr>
+      <w:r>
         <w:t>6. Evidence of Version Control</w:t>
       </w:r>
     </w:p>
@@ -2567,7 +2539,6 @@
         <w:rPr>
           <w:rFonts w:ascii="Calibri" w:hAnsi="Calibri" w:cs="Calibri"/>
         </w:rPr>
-        <w:lastRenderedPageBreak/>
         <w:t>Copy code</w:t>
       </w:r>
     </w:p>
@@ -2680,7 +2651,7 @@
           <w:rFonts w:ascii="Calibri" w:hAnsi="Calibri" w:cs="Calibri"/>
         </w:rPr>
       </w:pPr>
-      <w:hyperlink r:id="rId10" w:tgtFrame="_new" w:history="1">
+      <w:hyperlink r:id="rId11" w:tgtFrame="_new" w:history="1">
         <w:r>
           <w:rPr>
             <w:rStyle w:val="Hyperlink"/>
@@ -2694,24 +2665,17 @@
       <w:pPr>
         <w:rPr>
           <w:rFonts w:ascii="Calibri" w:hAnsi="Calibri" w:cs="Calibri"/>
-          <w:b/>
-          <w:bCs/>
-        </w:rPr>
-      </w:pPr>
-      <w:r>
-        <w:rPr>
-          <w:rFonts w:ascii="Calibri" w:hAnsi="Calibri" w:cs="Calibri"/>
-          <w:b/>
-          <w:bCs/>
-        </w:rPr>
+        </w:rPr>
+      </w:pPr>
+    </w:p>
+    <w:p>
+      <w:pPr>
+        <w:pStyle w:val="Heading2"/>
+      </w:pPr>
+      <w:r>
         <w:t>7. Full Code (in Zip File)</w:t>
       </w:r>
       <w:r>
-        <w:rPr>
-          <w:rFonts w:ascii="Calibri" w:hAnsi="Calibri" w:cs="Calibri"/>
-          <w:b/>
-          <w:bCs/>
-        </w:rPr>
         <w:t xml:space="preserve"> uploaded externally to Blackboard on 01/06/25</w:t>
       </w:r>
     </w:p>
@@ -2820,16 +2784,21 @@
       <w:pPr>
         <w:rPr>
           <w:rFonts w:ascii="Calibri" w:hAnsi="Calibri" w:cs="Calibri"/>
-          <w:b/>
-          <w:bCs/>
-        </w:rPr>
-      </w:pPr>
-      <w:r>
-        <w:rPr>
-          <w:rFonts w:ascii="Calibri" w:hAnsi="Calibri" w:cs="Calibri"/>
-          <w:b/>
-          <w:bCs/>
-        </w:rPr>
+        </w:rPr>
+      </w:pPr>
+    </w:p>
+    <w:p>
+      <w:pPr>
+        <w:rPr>
+          <w:rFonts w:ascii="Calibri" w:hAnsi="Calibri" w:cs="Calibri"/>
+        </w:rPr>
+      </w:pPr>
+    </w:p>
+    <w:p>
+      <w:pPr>
+        <w:pStyle w:val="Heading2"/>
+      </w:pPr>
+      <w:r>
         <w:t>8. References</w:t>
       </w:r>
     </w:p>
@@ -2959,7 +2928,7 @@
           <w:rFonts w:ascii="Calibri" w:hAnsi="Calibri" w:cs="Calibri"/>
         </w:rPr>
       </w:pPr>
-      <w:hyperlink r:id="rId11" w:tgtFrame="_new" w:history="1">
+      <w:hyperlink r:id="rId12" w:tgtFrame="_new" w:history="1">
         <w:r>
           <w:rPr>
             <w:rStyle w:val="Hyperlink"/>
@@ -3632,6 +3601,155 @@
     </w:lvl>
   </w:abstractNum>
   <w:abstractNum w:abstractNumId="4" w15:restartNumberingAfterBreak="0">
+    <w:nsid w:val="4C193091"/>
+    <w:multiLevelType w:val="multilevel"/>
+    <w:tmpl w:val="8BE2F0AE"/>
+    <w:lvl w:ilvl="0">
+      <w:start w:val="1"/>
+      <w:numFmt w:val="bullet"/>
+      <w:lvlText w:val=""/>
+      <w:lvlJc w:val="left"/>
+      <w:pPr>
+        <w:tabs>
+          <w:tab w:val="num" w:pos="720"/>
+        </w:tabs>
+        <w:ind w:left="720" w:hanging="360"/>
+      </w:pPr>
+      <w:rPr>
+        <w:rFonts w:ascii="Symbol" w:hAnsi="Symbol" w:hint="default"/>
+        <w:sz w:val="20"/>
+      </w:rPr>
+    </w:lvl>
+    <w:lvl w:ilvl="1">
+      <w:start w:val="1"/>
+      <w:numFmt w:val="bullet"/>
+      <w:lvlText w:val="o"/>
+      <w:lvlJc w:val="left"/>
+      <w:pPr>
+        <w:tabs>
+          <w:tab w:val="num" w:pos="1440"/>
+        </w:tabs>
+        <w:ind w:left="1440" w:hanging="360"/>
+      </w:pPr>
+      <w:rPr>
+        <w:rFonts w:ascii="Courier New" w:hAnsi="Courier New" w:hint="default"/>
+        <w:sz w:val="20"/>
+      </w:rPr>
+    </w:lvl>
+    <w:lvl w:ilvl="2" w:tentative="1">
+      <w:start w:val="1"/>
+      <w:numFmt w:val="bullet"/>
+      <w:lvlText w:val=""/>
+      <w:lvlJc w:val="left"/>
+      <w:pPr>
+        <w:tabs>
+          <w:tab w:val="num" w:pos="2160"/>
+        </w:tabs>
+        <w:ind w:left="2160" w:hanging="360"/>
+      </w:pPr>
+      <w:rPr>
+        <w:rFonts w:ascii="Wingdings" w:hAnsi="Wingdings" w:hint="default"/>
+        <w:sz w:val="20"/>
+      </w:rPr>
+    </w:lvl>
+    <w:lvl w:ilvl="3" w:tentative="1">
+      <w:start w:val="1"/>
+      <w:numFmt w:val="bullet"/>
+      <w:lvlText w:val=""/>
+      <w:lvlJc w:val="left"/>
+      <w:pPr>
+        <w:tabs>
+          <w:tab w:val="num" w:pos="2880"/>
+        </w:tabs>
+        <w:ind w:left="2880" w:hanging="360"/>
+      </w:pPr>
+      <w:rPr>
+        <w:rFonts w:ascii="Wingdings" w:hAnsi="Wingdings" w:hint="default"/>
+        <w:sz w:val="20"/>
+      </w:rPr>
+    </w:lvl>
+    <w:lvl w:ilvl="4" w:tentative="1">
+      <w:start w:val="1"/>
+      <w:numFmt w:val="bullet"/>
+      <w:lvlText w:val=""/>
+      <w:lvlJc w:val="left"/>
+      <w:pPr>
+        <w:tabs>
+          <w:tab w:val="num" w:pos="3600"/>
+        </w:tabs>
+        <w:ind w:left="3600" w:hanging="360"/>
+      </w:pPr>
+      <w:rPr>
+        <w:rFonts w:ascii="Wingdings" w:hAnsi="Wingdings" w:hint="default"/>
+        <w:sz w:val="20"/>
+      </w:rPr>
+    </w:lvl>
+    <w:lvl w:ilvl="5" w:tentative="1">
+      <w:start w:val="1"/>
+      <w:numFmt w:val="bullet"/>
+      <w:lvlText w:val=""/>
+      <w:lvlJc w:val="left"/>
+      <w:pPr>
+        <w:tabs>
+          <w:tab w:val="num" w:pos="4320"/>
+        </w:tabs>
+        <w:ind w:left="4320" w:hanging="360"/>
+      </w:pPr>
+      <w:rPr>
+        <w:rFonts w:ascii="Wingdings" w:hAnsi="Wingdings" w:hint="default"/>
+        <w:sz w:val="20"/>
+      </w:rPr>
+    </w:lvl>
+    <w:lvl w:ilvl="6" w:tentative="1">
+      <w:start w:val="1"/>
+      <w:numFmt w:val="bullet"/>
+      <w:lvlText w:val=""/>
+      <w:lvlJc w:val="left"/>
+      <w:pPr>
+        <w:tabs>
+          <w:tab w:val="num" w:pos="5040"/>
+        </w:tabs>
+        <w:ind w:left="5040" w:hanging="360"/>
+      </w:pPr>
+      <w:rPr>
+        <w:rFonts w:ascii="Wingdings" w:hAnsi="Wingdings" w:hint="default"/>
+        <w:sz w:val="20"/>
+      </w:rPr>
+    </w:lvl>
+    <w:lvl w:ilvl="7" w:tentative="1">
+      <w:start w:val="1"/>
+      <w:numFmt w:val="bullet"/>
+      <w:lvlText w:val=""/>
+      <w:lvlJc w:val="left"/>
+      <w:pPr>
+        <w:tabs>
+          <w:tab w:val="num" w:pos="5760"/>
+        </w:tabs>
+        <w:ind w:left="5760" w:hanging="360"/>
+      </w:pPr>
+      <w:rPr>
+        <w:rFonts w:ascii="Wingdings" w:hAnsi="Wingdings" w:hint="default"/>
+        <w:sz w:val="20"/>
+      </w:rPr>
+    </w:lvl>
+    <w:lvl w:ilvl="8" w:tentative="1">
+      <w:start w:val="1"/>
+      <w:numFmt w:val="bullet"/>
+      <w:lvlText w:val=""/>
+      <w:lvlJc w:val="left"/>
+      <w:pPr>
+        <w:tabs>
+          <w:tab w:val="num" w:pos="6480"/>
+        </w:tabs>
+        <w:ind w:left="6480" w:hanging="360"/>
+      </w:pPr>
+      <w:rPr>
+        <w:rFonts w:ascii="Wingdings" w:hAnsi="Wingdings" w:hint="default"/>
+        <w:sz w:val="20"/>
+      </w:rPr>
+    </w:lvl>
+  </w:abstractNum>
+  <w:abstractNum w:abstractNumId="5" w15:restartNumberingAfterBreak="0">
     <w:nsid w:val="4EDB77BD"/>
     <w:multiLevelType w:val="multilevel"/>
     <w:tmpl w:val="BD82A0D4"/>
@@ -3780,7 +3898,7 @@
       </w:rPr>
     </w:lvl>
   </w:abstractNum>
-  <w:abstractNum w:abstractNumId="5" w15:restartNumberingAfterBreak="0">
+  <w:abstractNum w:abstractNumId="6" w15:restartNumberingAfterBreak="0">
     <w:nsid w:val="58F15DC9"/>
     <w:multiLevelType w:val="multilevel"/>
     <w:tmpl w:val="4B2E7E04"/>
@@ -3929,7 +4047,7 @@
       </w:rPr>
     </w:lvl>
   </w:abstractNum>
-  <w:abstractNum w:abstractNumId="6" w15:restartNumberingAfterBreak="0">
+  <w:abstractNum w:abstractNumId="7" w15:restartNumberingAfterBreak="0">
     <w:nsid w:val="5A053034"/>
     <w:multiLevelType w:val="multilevel"/>
     <w:tmpl w:val="F87EA5B0"/>
@@ -4046,7 +4164,7 @@
       </w:pPr>
     </w:lvl>
   </w:abstractNum>
-  <w:abstractNum w:abstractNumId="7" w15:restartNumberingAfterBreak="0">
+  <w:abstractNum w:abstractNumId="8" w15:restartNumberingAfterBreak="0">
     <w:nsid w:val="5B790AD9"/>
     <w:multiLevelType w:val="multilevel"/>
     <w:tmpl w:val="8BE2F0AE"/>
@@ -4195,7 +4313,7 @@
       </w:rPr>
     </w:lvl>
   </w:abstractNum>
-  <w:abstractNum w:abstractNumId="8" w15:restartNumberingAfterBreak="0">
+  <w:abstractNum w:abstractNumId="9" w15:restartNumberingAfterBreak="0">
     <w:nsid w:val="5BF87C9F"/>
     <w:multiLevelType w:val="multilevel"/>
     <w:tmpl w:val="7BA4A586"/>
@@ -4308,7 +4426,7 @@
       </w:pPr>
     </w:lvl>
   </w:abstractNum>
-  <w:abstractNum w:abstractNumId="9" w15:restartNumberingAfterBreak="0">
+  <w:abstractNum w:abstractNumId="10" w15:restartNumberingAfterBreak="0">
     <w:nsid w:val="71784686"/>
     <w:multiLevelType w:val="multilevel"/>
     <w:tmpl w:val="A3A8EF0C"/>
@@ -4457,11 +4575,160 @@
       </w:rPr>
     </w:lvl>
   </w:abstractNum>
+  <w:abstractNum w:abstractNumId="11" w15:restartNumberingAfterBreak="0">
+    <w:nsid w:val="77DA3DD9"/>
+    <w:multiLevelType w:val="multilevel"/>
+    <w:tmpl w:val="BD82A0D4"/>
+    <w:lvl w:ilvl="0">
+      <w:start w:val="1"/>
+      <w:numFmt w:val="bullet"/>
+      <w:lvlText w:val=""/>
+      <w:lvlJc w:val="left"/>
+      <w:pPr>
+        <w:tabs>
+          <w:tab w:val="num" w:pos="720"/>
+        </w:tabs>
+        <w:ind w:left="720" w:hanging="360"/>
+      </w:pPr>
+      <w:rPr>
+        <w:rFonts w:ascii="Symbol" w:hAnsi="Symbol" w:hint="default"/>
+        <w:sz w:val="20"/>
+      </w:rPr>
+    </w:lvl>
+    <w:lvl w:ilvl="1">
+      <w:start w:val="1"/>
+      <w:numFmt w:val="bullet"/>
+      <w:lvlText w:val="o"/>
+      <w:lvlJc w:val="left"/>
+      <w:pPr>
+        <w:tabs>
+          <w:tab w:val="num" w:pos="1440"/>
+        </w:tabs>
+        <w:ind w:left="1440" w:hanging="360"/>
+      </w:pPr>
+      <w:rPr>
+        <w:rFonts w:ascii="Courier New" w:hAnsi="Courier New" w:hint="default"/>
+        <w:sz w:val="20"/>
+      </w:rPr>
+    </w:lvl>
+    <w:lvl w:ilvl="2" w:tentative="1">
+      <w:start w:val="1"/>
+      <w:numFmt w:val="bullet"/>
+      <w:lvlText w:val=""/>
+      <w:lvlJc w:val="left"/>
+      <w:pPr>
+        <w:tabs>
+          <w:tab w:val="num" w:pos="2160"/>
+        </w:tabs>
+        <w:ind w:left="2160" w:hanging="360"/>
+      </w:pPr>
+      <w:rPr>
+        <w:rFonts w:ascii="Wingdings" w:hAnsi="Wingdings" w:hint="default"/>
+        <w:sz w:val="20"/>
+      </w:rPr>
+    </w:lvl>
+    <w:lvl w:ilvl="3" w:tentative="1">
+      <w:start w:val="1"/>
+      <w:numFmt w:val="bullet"/>
+      <w:lvlText w:val=""/>
+      <w:lvlJc w:val="left"/>
+      <w:pPr>
+        <w:tabs>
+          <w:tab w:val="num" w:pos="2880"/>
+        </w:tabs>
+        <w:ind w:left="2880" w:hanging="360"/>
+      </w:pPr>
+      <w:rPr>
+        <w:rFonts w:ascii="Wingdings" w:hAnsi="Wingdings" w:hint="default"/>
+        <w:sz w:val="20"/>
+      </w:rPr>
+    </w:lvl>
+    <w:lvl w:ilvl="4" w:tentative="1">
+      <w:start w:val="1"/>
+      <w:numFmt w:val="bullet"/>
+      <w:lvlText w:val=""/>
+      <w:lvlJc w:val="left"/>
+      <w:pPr>
+        <w:tabs>
+          <w:tab w:val="num" w:pos="3600"/>
+        </w:tabs>
+        <w:ind w:left="3600" w:hanging="360"/>
+      </w:pPr>
+      <w:rPr>
+        <w:rFonts w:ascii="Wingdings" w:hAnsi="Wingdings" w:hint="default"/>
+        <w:sz w:val="20"/>
+      </w:rPr>
+    </w:lvl>
+    <w:lvl w:ilvl="5" w:tentative="1">
+      <w:start w:val="1"/>
+      <w:numFmt w:val="bullet"/>
+      <w:lvlText w:val=""/>
+      <w:lvlJc w:val="left"/>
+      <w:pPr>
+        <w:tabs>
+          <w:tab w:val="num" w:pos="4320"/>
+        </w:tabs>
+        <w:ind w:left="4320" w:hanging="360"/>
+      </w:pPr>
+      <w:rPr>
+        <w:rFonts w:ascii="Wingdings" w:hAnsi="Wingdings" w:hint="default"/>
+        <w:sz w:val="20"/>
+      </w:rPr>
+    </w:lvl>
+    <w:lvl w:ilvl="6" w:tentative="1">
+      <w:start w:val="1"/>
+      <w:numFmt w:val="bullet"/>
+      <w:lvlText w:val=""/>
+      <w:lvlJc w:val="left"/>
+      <w:pPr>
+        <w:tabs>
+          <w:tab w:val="num" w:pos="5040"/>
+        </w:tabs>
+        <w:ind w:left="5040" w:hanging="360"/>
+      </w:pPr>
+      <w:rPr>
+        <w:rFonts w:ascii="Wingdings" w:hAnsi="Wingdings" w:hint="default"/>
+        <w:sz w:val="20"/>
+      </w:rPr>
+    </w:lvl>
+    <w:lvl w:ilvl="7" w:tentative="1">
+      <w:start w:val="1"/>
+      <w:numFmt w:val="bullet"/>
+      <w:lvlText w:val=""/>
+      <w:lvlJc w:val="left"/>
+      <w:pPr>
+        <w:tabs>
+          <w:tab w:val="num" w:pos="5760"/>
+        </w:tabs>
+        <w:ind w:left="5760" w:hanging="360"/>
+      </w:pPr>
+      <w:rPr>
+        <w:rFonts w:ascii="Wingdings" w:hAnsi="Wingdings" w:hint="default"/>
+        <w:sz w:val="20"/>
+      </w:rPr>
+    </w:lvl>
+    <w:lvl w:ilvl="8" w:tentative="1">
+      <w:start w:val="1"/>
+      <w:numFmt w:val="bullet"/>
+      <w:lvlText w:val=""/>
+      <w:lvlJc w:val="left"/>
+      <w:pPr>
+        <w:tabs>
+          <w:tab w:val="num" w:pos="6480"/>
+        </w:tabs>
+        <w:ind w:left="6480" w:hanging="360"/>
+      </w:pPr>
+      <w:rPr>
+        <w:rFonts w:ascii="Wingdings" w:hAnsi="Wingdings" w:hint="default"/>
+        <w:sz w:val="20"/>
+      </w:rPr>
+    </w:lvl>
+  </w:abstractNum>
   <w:num w:numId="1" w16cid:durableId="1790396445">
-    <w:abstractNumId w:val="7"/>
+    <w:abstractNumId w:val="8"/>
   </w:num>
   <w:num w:numId="2" w16cid:durableId="1197428200">
-    <w:abstractNumId w:val="4"/>
+    <w:abstractNumId w:val="5"/>
   </w:num>
   <w:num w:numId="3" w16cid:durableId="576743071">
     <w:abstractNumId w:val="0"/>
@@ -4493,19 +4760,25 @@
     <w:abstractNumId w:val="1"/>
   </w:num>
   <w:num w:numId="7" w16cid:durableId="1309356844">
-    <w:abstractNumId w:val="8"/>
+    <w:abstractNumId w:val="9"/>
   </w:num>
   <w:num w:numId="8" w16cid:durableId="1771125893">
-    <w:abstractNumId w:val="5"/>
+    <w:abstractNumId w:val="6"/>
   </w:num>
   <w:num w:numId="9" w16cid:durableId="835654034">
-    <w:abstractNumId w:val="9"/>
+    <w:abstractNumId w:val="10"/>
   </w:num>
   <w:num w:numId="10" w16cid:durableId="1564632076">
     <w:abstractNumId w:val="2"/>
   </w:num>
   <w:num w:numId="11" w16cid:durableId="2083528113">
-    <w:abstractNumId w:val="6"/>
+    <w:abstractNumId w:val="7"/>
+  </w:num>
+  <w:num w:numId="12" w16cid:durableId="1526360683">
+    <w:abstractNumId w:val="4"/>
+  </w:num>
+  <w:num w:numId="13" w16cid:durableId="2126924757">
+    <w:abstractNumId w:val="11"/>
   </w:num>
 </w:numbering>
 </file>
@@ -4969,7 +5242,6 @@
     <w:next w:val="Normal"/>
     <w:link w:val="Heading3Char"/>
     <w:uiPriority w:val="9"/>
-    <w:semiHidden/>
     <w:unhideWhenUsed/>
     <w:qFormat/>
     <w:rsid w:val="00710B8D"/>
@@ -5197,7 +5469,6 @@
     <w:basedOn w:val="DefaultParagraphFont"/>
     <w:link w:val="Heading3"/>
     <w:uiPriority w:val="9"/>
-    <w:semiHidden/>
     <w:rsid w:val="00710B8D"/>
     <w:rPr>
       <w:rFonts w:eastAsiaTheme="majorEastAsia" w:cstheme="majorBidi"/>

</xml_diff>